<commit_message>
Diagrama e informe: servicios con metodos void
</commit_message>
<xml_diff>
--- a/docs/Sonrisa Feliz Informe Academico.docx
+++ b/docs/Sonrisa Feliz Informe Academico.docx
@@ -3807,7 +3807,7 @@
           <w:vertAlign w:val="baseline"/>
           <w:rtl w:val="0"/>
         </w:rPr>
-        <w:t xml:space="preserve">se unificaron validaciones que estaban duplicadas, como el control de horario ocupado de los turnos y la validación de los datos personales del paciente.</w:t>
+        <w:t xml:space="preserve">se unificaron validaciones que estaban duplicadas, como el control de horario ocupado de los turnos y la validación de los datos personales del paciente. Además, los métodos de alta, modificación y baja que siempre devolvían true ahora no devuelven nada (void).</w:t>
       </w:r>
     </w:p>
     <w:p>
@@ -4675,7 +4675,7 @@
         <w:rPr/>
         <w:drawing>
           <wp:inline distB="0" distT="0" distL="0" distR="0">
-            <wp:extent cx="6191089" cy="5577840"/>
+            <wp:extent cx="6152029" cy="5577840"/>
             <wp:effectExtent b="0" l="0" r="0" t="0"/>
             <wp:docPr id="3" name="diagrama_v6.png"/>
             <a:graphic>
@@ -4695,7 +4695,7 @@
                   <pic:spPr>
                     <a:xfrm>
                       <a:off x="0" y="0"/>
-                      <a:ext cx="6191089" cy="5577840"/>
+                      <a:ext cx="6152029" cy="5577840"/>
                     </a:xfrm>
                     <a:prstGeom prst="rect"/>
                     <a:ln/>

</xml_diff>

<commit_message>
Correcciones de errores (turnos, bajas, validaciones, pantallas) + RF04 horario de atencion
</commit_message>
<xml_diff>
--- a/docs/Sonrisa Feliz Informe Academico.docx
+++ b/docs/Sonrisa Feliz Informe Academico.docx
@@ -3548,7 +3548,7 @@
         <w:rPr>
           <w:rtl w:val="0"/>
         </w:rPr>
-        <w:t xml:space="preserve">4. Entrega 2 – Reestructuración del código y domicilio del paciente</w:t>
+        <w:t xml:space="preserve">4. Entrega 2 – Reestructuración del código, domicilio del paciente y correcciones</w:t>
       </w:r>
     </w:p>
     <w:p>
@@ -4315,7 +4315,18 @@
         <w:rPr>
           <w:rtl w:val="0"/>
         </w:rPr>
-        <w:t xml:space="preserve">4.4. Pruebas realizadas</w:t>
+        <w:t xml:space="preserve">4.4. Correcciones de errores</w:t>
+      </w:r>
+    </w:p>
+    <w:p>
+      <w:pPr>
+        <w:rPr/>
+      </w:pPr>
+      <w:r>
+        <w:rPr>
+          <w:rtl w:val="0"/>
+        </w:rPr>
+        <w:t xml:space="preserve">Se probó el sistema en detalle (reservas, modificaciones, bajas, búsquedas y reinicio del programa) y se corrigieron los errores encontrados:</w:t>
       </w:r>
     </w:p>
     <w:p>
@@ -4371,26 +4382,26 @@
           <w:vertAlign w:val="baseline"/>
           <w:rtl w:val="0"/>
         </w:rPr>
-        <w:t xml:space="preserve">Datos guardados: </w:t>
-      </w:r>
-      <w:r>
-        <w:rPr>
-          <w:rFonts w:ascii="Arial" w:cs="Arial" w:eastAsia="Arial" w:hAnsi="Arial"/>
-          <w:b w:val="0"/>
-          <w:bCs w:val="0"/>
-          <w:i w:val="0"/>
-          <w:iCs w:val="0"/>
-          <w:smallCaps w:val="0"/>
-          <w:strike w:val="0"/>
-          <w:color w:val="000000"/>
-          <w:sz w:val="21"/>
-          <w:szCs w:val="21"/>
-          <w:u w:val="none"/>
-          <w:shd w:fill="auto" w:val="clear"/>
-          <w:vertAlign w:val="baseline"/>
-          <w:rtl w:val="0"/>
-        </w:rPr>
-        <w:t xml:space="preserve">carga de los archivos .dat existentes y conservación de los datos al reiniciar.</w:t>
+        <w:t xml:space="preserve">Superposición de turnos: </w:t>
+      </w:r>
+      <w:r>
+        <w:rPr>
+          <w:rFonts w:ascii="Arial" w:cs="Arial" w:eastAsia="Arial" w:hAnsi="Arial"/>
+          <w:b w:val="0"/>
+          <w:bCs w:val="0"/>
+          <w:i w:val="0"/>
+          <w:iCs w:val="0"/>
+          <w:smallCaps w:val="0"/>
+          <w:strike w:val="0"/>
+          <w:color w:val="000000"/>
+          <w:sz w:val="21"/>
+          <w:szCs w:val="21"/>
+          <w:u w:val="none"/>
+          <w:shd w:fill="auto" w:val="clear"/>
+          <w:vertAlign w:val="baseline"/>
+          <w:rtl w:val="0"/>
+        </w:rPr>
+        <w:t xml:space="preserve">antes solo se rechazaba un turno con la misma hora exacta de inicio. Ahora se tiene en cuenta la duración de cada consulta, tanto para el odontólogo como para el paciente (un paciente ya no puede tener dos turnos al mismo tiempo con distintos odontólogos).</w:t>
       </w:r>
     </w:p>
     <w:p>
@@ -4446,26 +4457,26 @@
           <w:vertAlign w:val="baseline"/>
           <w:rtl w:val="0"/>
         </w:rPr>
-        <w:t xml:space="preserve">Funcionamiento sin cambios: </w:t>
-      </w:r>
-      <w:r>
-        <w:rPr>
-          <w:rFonts w:ascii="Arial" w:cs="Arial" w:eastAsia="Arial" w:hAnsi="Arial"/>
-          <w:b w:val="0"/>
-          <w:bCs w:val="0"/>
-          <w:i w:val="0"/>
-          <w:iCs w:val="0"/>
-          <w:smallCaps w:val="0"/>
-          <w:strike w:val="0"/>
-          <w:color w:val="000000"/>
-          <w:sz w:val="21"/>
-          <w:szCs w:val="21"/>
-          <w:u w:val="none"/>
-          <w:shd w:fill="auto" w:val="clear"/>
-          <w:vertAlign w:val="baseline"/>
-          <w:rtl w:val="0"/>
-        </w:rPr>
-        <w:t xml:space="preserve">alta, modificación y baja de pacientes, odontólogos y turnos, con los mismos resultados y mensajes que la versión anterior; rechazo de turnos en un horario ocupado, de fechas mal escritas y de rangos de fechas invertidos.</w:t>
+        <w:t xml:space="preserve">Turnos cancelados: </w:t>
+      </w:r>
+      <w:r>
+        <w:rPr>
+          <w:rFonts w:ascii="Arial" w:cs="Arial" w:eastAsia="Arial" w:hAnsi="Arial"/>
+          <w:b w:val="0"/>
+          <w:bCs w:val="0"/>
+          <w:i w:val="0"/>
+          <w:iCs w:val="0"/>
+          <w:smallCaps w:val="0"/>
+          <w:strike w:val="0"/>
+          <w:color w:val="000000"/>
+          <w:sz w:val="21"/>
+          <w:szCs w:val="21"/>
+          <w:u w:val="none"/>
+          <w:shd w:fill="auto" w:val="clear"/>
+          <w:vertAlign w:val="baseline"/>
+          <w:rtl w:val="0"/>
+        </w:rPr>
+        <w:t xml:space="preserve">ya no ocupan el horario, que queda libre para otra reserva. Si un turno cancelado se reactiva, se controla que su horario siga libre.</w:t>
       </w:r>
     </w:p>
     <w:p>
@@ -4521,6 +4532,618 @@
           <w:vertAlign w:val="baseline"/>
           <w:rtl w:val="0"/>
         </w:rPr>
+        <w:t xml:space="preserve">Horario de atención (RF04): </w:t>
+      </w:r>
+      <w:r>
+        <w:rPr>
+          <w:rFonts w:ascii="Arial" w:cs="Arial" w:eastAsia="Arial" w:hAnsi="Arial"/>
+          <w:b w:val="0"/>
+          <w:bCs w:val="0"/>
+          <w:i w:val="0"/>
+          <w:iCs w:val="0"/>
+          <w:smallCaps w:val="0"/>
+          <w:strike w:val="0"/>
+          <w:color w:val="000000"/>
+          <w:sz w:val="21"/>
+          <w:szCs w:val="21"/>
+          <w:u w:val="none"/>
+          <w:shd w:fill="auto" w:val="clear"/>
+          <w:vertAlign w:val="baseline"/>
+          <w:rtl w:val="0"/>
+        </w:rPr>
+        <w:t xml:space="preserve">no se permiten turnos en fechas pasadas ni fuera del horario de la clínica, de lunes a sábado de 08:00 a 20:00. Se tiene en cuenta la duración de la consulta para que el turno termine antes del cierre.</w:t>
+      </w:r>
+    </w:p>
+    <w:p>
+      <w:pPr>
+        <w:keepNext w:val="0"/>
+        <w:keepLines w:val="0"/>
+        <w:pageBreakBefore w:val="0"/>
+        <w:widowControl w:val="1"/>
+        <w:numPr>
+          <w:ilvl w:val="0"/>
+          <w:numId w:val="1"/>
+        </w:numPr>
+        <w:pBdr>
+          <w:top w:space="0" w:sz="0" w:val="nil"/>
+          <w:left w:space="0" w:sz="0" w:val="nil"/>
+          <w:bottom w:space="0" w:sz="0" w:val="nil"/>
+          <w:right w:space="0" w:sz="0" w:val="nil"/>
+          <w:between w:space="0" w:sz="0" w:val="nil"/>
+        </w:pBdr>
+        <w:shd w:fill="auto" w:val="clear"/>
+        <w:spacing w:after="0" w:before="0" w:line="269" w:lineRule="auto"/>
+        <w:ind w:left="360" w:right="0" w:hanging="360"/>
+        <w:jc w:val="left"/>
+        <w:rPr>
+          <w:b w:val="0"/>
+          <w:bCs w:val="0"/>
+          <w:i w:val="0"/>
+          <w:iCs w:val="0"/>
+          <w:smallCaps w:val="0"/>
+          <w:strike w:val="0"/>
+          <w:color w:val="000000"/>
+          <w:sz w:val="21"/>
+          <w:szCs w:val="21"/>
+          <w:u w:val="none"/>
+          <w:shd w:fill="auto" w:val="clear"/>
+          <w:vertAlign w:val="baseline"/>
+        </w:rPr>
+      </w:pPr>
+      <w:r>
+        <w:rPr>
+          <w:rFonts w:ascii="Arial" w:cs="Arial" w:eastAsia="Arial" w:hAnsi="Arial"/>
+          <w:b w:val="1"/>
+          <w:bCs w:val="1"/>
+          <w:i w:val="0"/>
+          <w:iCs w:val="0"/>
+          <w:smallCaps w:val="0"/>
+          <w:strike w:val="0"/>
+          <w:color w:val="000000"/>
+          <w:sz w:val="21"/>
+          <w:szCs w:val="21"/>
+          <w:u w:val="none"/>
+          <w:shd w:fill="auto" w:val="clear"/>
+          <w:vertAlign w:val="baseline"/>
+          <w:rtl w:val="0"/>
+        </w:rPr>
+        <w:t xml:space="preserve">Bajas: </w:t>
+      </w:r>
+      <w:r>
+        <w:rPr>
+          <w:rFonts w:ascii="Arial" w:cs="Arial" w:eastAsia="Arial" w:hAnsi="Arial"/>
+          <w:b w:val="0"/>
+          <w:bCs w:val="0"/>
+          <w:i w:val="0"/>
+          <w:iCs w:val="0"/>
+          <w:smallCaps w:val="0"/>
+          <w:strike w:val="0"/>
+          <w:color w:val="000000"/>
+          <w:sz w:val="21"/>
+          <w:szCs w:val="21"/>
+          <w:u w:val="none"/>
+          <w:shd w:fill="auto" w:val="clear"/>
+          <w:vertAlign w:val="baseline"/>
+          <w:rtl w:val="0"/>
+        </w:rPr>
+        <w:t xml:space="preserve">no se puede eliminar un paciente ni un odontólogo que tenga turnos registrados; primero hay que eliminar sus turnos. Antes quedaban turnos que mostraban datos de alguien ya eliminado.</w:t>
+      </w:r>
+    </w:p>
+    <w:p>
+      <w:pPr>
+        <w:keepNext w:val="0"/>
+        <w:keepLines w:val="0"/>
+        <w:pageBreakBefore w:val="0"/>
+        <w:widowControl w:val="1"/>
+        <w:numPr>
+          <w:ilvl w:val="0"/>
+          <w:numId w:val="1"/>
+        </w:numPr>
+        <w:pBdr>
+          <w:top w:space="0" w:sz="0" w:val="nil"/>
+          <w:left w:space="0" w:sz="0" w:val="nil"/>
+          <w:bottom w:space="0" w:sz="0" w:val="nil"/>
+          <w:right w:space="0" w:sz="0" w:val="nil"/>
+          <w:between w:space="0" w:sz="0" w:val="nil"/>
+        </w:pBdr>
+        <w:shd w:fill="auto" w:val="clear"/>
+        <w:spacing w:after="0" w:before="0" w:line="269" w:lineRule="auto"/>
+        <w:ind w:left="360" w:right="0" w:hanging="360"/>
+        <w:jc w:val="left"/>
+        <w:rPr>
+          <w:b w:val="0"/>
+          <w:bCs w:val="0"/>
+          <w:i w:val="0"/>
+          <w:iCs w:val="0"/>
+          <w:smallCaps w:val="0"/>
+          <w:strike w:val="0"/>
+          <w:color w:val="000000"/>
+          <w:sz w:val="21"/>
+          <w:szCs w:val="21"/>
+          <w:u w:val="none"/>
+          <w:shd w:fill="auto" w:val="clear"/>
+          <w:vertAlign w:val="baseline"/>
+        </w:rPr>
+      </w:pPr>
+      <w:r>
+        <w:rPr>
+          <w:rFonts w:ascii="Arial" w:cs="Arial" w:eastAsia="Arial" w:hAnsi="Arial"/>
+          <w:b w:val="1"/>
+          <w:bCs w:val="1"/>
+          <w:i w:val="0"/>
+          <w:iCs w:val="0"/>
+          <w:smallCaps w:val="0"/>
+          <w:strike w:val="0"/>
+          <w:color w:val="000000"/>
+          <w:sz w:val="21"/>
+          <w:szCs w:val="21"/>
+          <w:u w:val="none"/>
+          <w:shd w:fill="auto" w:val="clear"/>
+          <w:vertAlign w:val="baseline"/>
+          <w:rtl w:val="0"/>
+        </w:rPr>
+        <w:t xml:space="preserve">Datos tras reiniciar: </w:t>
+      </w:r>
+      <w:r>
+        <w:rPr>
+          <w:rFonts w:ascii="Arial" w:cs="Arial" w:eastAsia="Arial" w:hAnsi="Arial"/>
+          <w:b w:val="0"/>
+          <w:bCs w:val="0"/>
+          <w:i w:val="0"/>
+          <w:iCs w:val="0"/>
+          <w:smallCaps w:val="0"/>
+          <w:strike w:val="0"/>
+          <w:color w:val="000000"/>
+          <w:sz w:val="21"/>
+          <w:szCs w:val="21"/>
+          <w:u w:val="none"/>
+          <w:shd w:fill="auto" w:val="clear"/>
+          <w:vertAlign w:val="baseline"/>
+          <w:rtl w:val="0"/>
+        </w:rPr>
+        <w:t xml:space="preserve">los cambios en un paciente u odontólogo (por ejemplo, su nombre) ahora se ven también en sus turnos después de cerrar y volver a abrir el programa.</w:t>
+      </w:r>
+    </w:p>
+    <w:p>
+      <w:pPr>
+        <w:keepNext w:val="0"/>
+        <w:keepLines w:val="0"/>
+        <w:pageBreakBefore w:val="0"/>
+        <w:widowControl w:val="1"/>
+        <w:numPr>
+          <w:ilvl w:val="0"/>
+          <w:numId w:val="1"/>
+        </w:numPr>
+        <w:pBdr>
+          <w:top w:space="0" w:sz="0" w:val="nil"/>
+          <w:left w:space="0" w:sz="0" w:val="nil"/>
+          <w:bottom w:space="0" w:sz="0" w:val="nil"/>
+          <w:right w:space="0" w:sz="0" w:val="nil"/>
+          <w:between w:space="0" w:sz="0" w:val="nil"/>
+        </w:pBdr>
+        <w:shd w:fill="auto" w:val="clear"/>
+        <w:spacing w:after="0" w:before="0" w:line="269" w:lineRule="auto"/>
+        <w:ind w:left="360" w:right="0" w:hanging="360"/>
+        <w:jc w:val="left"/>
+        <w:rPr>
+          <w:b w:val="0"/>
+          <w:bCs w:val="0"/>
+          <w:i w:val="0"/>
+          <w:iCs w:val="0"/>
+          <w:smallCaps w:val="0"/>
+          <w:strike w:val="0"/>
+          <w:color w:val="000000"/>
+          <w:sz w:val="21"/>
+          <w:szCs w:val="21"/>
+          <w:u w:val="none"/>
+          <w:shd w:fill="auto" w:val="clear"/>
+          <w:vertAlign w:val="baseline"/>
+        </w:rPr>
+      </w:pPr>
+      <w:r>
+        <w:rPr>
+          <w:rFonts w:ascii="Arial" w:cs="Arial" w:eastAsia="Arial" w:hAnsi="Arial"/>
+          <w:b w:val="1"/>
+          <w:bCs w:val="1"/>
+          <w:i w:val="0"/>
+          <w:iCs w:val="0"/>
+          <w:smallCaps w:val="0"/>
+          <w:strike w:val="0"/>
+          <w:color w:val="000000"/>
+          <w:sz w:val="21"/>
+          <w:szCs w:val="21"/>
+          <w:u w:val="none"/>
+          <w:shd w:fill="auto" w:val="clear"/>
+          <w:vertAlign w:val="baseline"/>
+          <w:rtl w:val="0"/>
+        </w:rPr>
+        <w:t xml:space="preserve">Pantalla de turnos: </w:t>
+      </w:r>
+      <w:r>
+        <w:rPr>
+          <w:rFonts w:ascii="Arial" w:cs="Arial" w:eastAsia="Arial" w:hAnsi="Arial"/>
+          <w:b w:val="0"/>
+          <w:bCs w:val="0"/>
+          <w:i w:val="0"/>
+          <w:iCs w:val="0"/>
+          <w:smallCaps w:val="0"/>
+          <w:strike w:val="0"/>
+          <w:color w:val="000000"/>
+          <w:sz w:val="21"/>
+          <w:szCs w:val="21"/>
+          <w:u w:val="none"/>
+          <w:shd w:fill="auto" w:val="clear"/>
+          <w:vertAlign w:val="baseline"/>
+          <w:rtl w:val="0"/>
+        </w:rPr>
+        <w:t xml:space="preserve">el formulario tiene barra de desplazamiento cuando la ventana es chica; al seleccionar un turno se muestran su paciente y su odontólogo (que no se pueden cambiar al modificar); la tabla se actualiza al entrar a la pestaña; la hora se acepta como 9:00 o 09:00.</w:t>
+      </w:r>
+    </w:p>
+    <w:p>
+      <w:pPr>
+        <w:keepNext w:val="0"/>
+        <w:keepLines w:val="0"/>
+        <w:pageBreakBefore w:val="0"/>
+        <w:widowControl w:val="1"/>
+        <w:numPr>
+          <w:ilvl w:val="0"/>
+          <w:numId w:val="1"/>
+        </w:numPr>
+        <w:pBdr>
+          <w:top w:space="0" w:sz="0" w:val="nil"/>
+          <w:left w:space="0" w:sz="0" w:val="nil"/>
+          <w:bottom w:space="0" w:sz="0" w:val="nil"/>
+          <w:right w:space="0" w:sz="0" w:val="nil"/>
+          <w:between w:space="0" w:sz="0" w:val="nil"/>
+        </w:pBdr>
+        <w:shd w:fill="auto" w:val="clear"/>
+        <w:spacing w:after="0" w:before="0" w:line="269" w:lineRule="auto"/>
+        <w:ind w:left="360" w:right="0" w:hanging="360"/>
+        <w:jc w:val="left"/>
+        <w:rPr>
+          <w:b w:val="0"/>
+          <w:bCs w:val="0"/>
+          <w:i w:val="0"/>
+          <w:iCs w:val="0"/>
+          <w:smallCaps w:val="0"/>
+          <w:strike w:val="0"/>
+          <w:color w:val="000000"/>
+          <w:sz w:val="21"/>
+          <w:szCs w:val="21"/>
+          <w:u w:val="none"/>
+          <w:shd w:fill="auto" w:val="clear"/>
+          <w:vertAlign w:val="baseline"/>
+        </w:rPr>
+      </w:pPr>
+      <w:r>
+        <w:rPr>
+          <w:rFonts w:ascii="Arial" w:cs="Arial" w:eastAsia="Arial" w:hAnsi="Arial"/>
+          <w:b w:val="1"/>
+          <w:bCs w:val="1"/>
+          <w:i w:val="0"/>
+          <w:iCs w:val="0"/>
+          <w:smallCaps w:val="0"/>
+          <w:strike w:val="0"/>
+          <w:color w:val="000000"/>
+          <w:sz w:val="21"/>
+          <w:szCs w:val="21"/>
+          <w:u w:val="none"/>
+          <w:shd w:fill="auto" w:val="clear"/>
+          <w:vertAlign w:val="baseline"/>
+          <w:rtl w:val="0"/>
+        </w:rPr>
+        <w:t xml:space="preserve">Pantalla de odontólogos: </w:t>
+      </w:r>
+      <w:r>
+        <w:rPr>
+          <w:rFonts w:ascii="Arial" w:cs="Arial" w:eastAsia="Arial" w:hAnsi="Arial"/>
+          <w:b w:val="0"/>
+          <w:bCs w:val="0"/>
+          <w:i w:val="0"/>
+          <w:iCs w:val="0"/>
+          <w:smallCaps w:val="0"/>
+          <w:strike w:val="0"/>
+          <w:color w:val="000000"/>
+          <w:sz w:val="21"/>
+          <w:szCs w:val="21"/>
+          <w:u w:val="none"/>
+          <w:shd w:fill="auto" w:val="clear"/>
+          <w:vertAlign w:val="baseline"/>
+          <w:rtl w:val="0"/>
+        </w:rPr>
+        <w:t xml:space="preserve">la especialidad queda bloqueada al modificar, ya que antes se mostraba como modificada sin cambiar.</w:t>
+      </w:r>
+    </w:p>
+    <w:p>
+      <w:pPr>
+        <w:keepNext w:val="0"/>
+        <w:keepLines w:val="0"/>
+        <w:pageBreakBefore w:val="0"/>
+        <w:widowControl w:val="1"/>
+        <w:numPr>
+          <w:ilvl w:val="0"/>
+          <w:numId w:val="1"/>
+        </w:numPr>
+        <w:pBdr>
+          <w:top w:space="0" w:sz="0" w:val="nil"/>
+          <w:left w:space="0" w:sz="0" w:val="nil"/>
+          <w:bottom w:space="0" w:sz="0" w:val="nil"/>
+          <w:right w:space="0" w:sz="0" w:val="nil"/>
+          <w:between w:space="0" w:sz="0" w:val="nil"/>
+        </w:pBdr>
+        <w:shd w:fill="auto" w:val="clear"/>
+        <w:spacing w:after="0" w:before="0" w:line="269" w:lineRule="auto"/>
+        <w:ind w:left="360" w:right="0" w:hanging="360"/>
+        <w:jc w:val="left"/>
+        <w:rPr>
+          <w:b w:val="0"/>
+          <w:bCs w:val="0"/>
+          <w:i w:val="0"/>
+          <w:iCs w:val="0"/>
+          <w:smallCaps w:val="0"/>
+          <w:strike w:val="0"/>
+          <w:color w:val="000000"/>
+          <w:sz w:val="21"/>
+          <w:szCs w:val="21"/>
+          <w:u w:val="none"/>
+          <w:shd w:fill="auto" w:val="clear"/>
+          <w:vertAlign w:val="baseline"/>
+        </w:rPr>
+      </w:pPr>
+      <w:r>
+        <w:rPr>
+          <w:rFonts w:ascii="Arial" w:cs="Arial" w:eastAsia="Arial" w:hAnsi="Arial"/>
+          <w:b w:val="1"/>
+          <w:bCs w:val="1"/>
+          <w:i w:val="0"/>
+          <w:iCs w:val="0"/>
+          <w:smallCaps w:val="0"/>
+          <w:strike w:val="0"/>
+          <w:color w:val="000000"/>
+          <w:sz w:val="21"/>
+          <w:szCs w:val="21"/>
+          <w:u w:val="none"/>
+          <w:shd w:fill="auto" w:val="clear"/>
+          <w:vertAlign w:val="baseline"/>
+          <w:rtl w:val="0"/>
+        </w:rPr>
+        <w:t xml:space="preserve">Validaciones y búsquedas: </w:t>
+      </w:r>
+      <w:r>
+        <w:rPr>
+          <w:rFonts w:ascii="Arial" w:cs="Arial" w:eastAsia="Arial" w:hAnsi="Arial"/>
+          <w:b w:val="0"/>
+          <w:bCs w:val="0"/>
+          <w:i w:val="0"/>
+          <w:iCs w:val="0"/>
+          <w:smallCaps w:val="0"/>
+          <w:strike w:val="0"/>
+          <w:color w:val="000000"/>
+          <w:sz w:val="21"/>
+          <w:szCs w:val="21"/>
+          <w:u w:val="none"/>
+          <w:shd w:fill="auto" w:val="clear"/>
+          <w:vertAlign w:val="baseline"/>
+          <w:rtl w:val="0"/>
+        </w:rPr>
+        <w:t xml:space="preserve">nombres y apellidos solo con letras, e-mail con formato válido, número de calle y matrícula mayores a 0. Buscar turnos de un DNI o matrícula inexistente ahora lo informa. Los números de ID ya no se saltean cuando se rechaza un alta.</w:t>
+      </w:r>
+    </w:p>
+    <w:p>
+      <w:pPr>
+        <w:pStyle w:val="Heading2"/>
+        <w:rPr/>
+      </w:pPr>
+      <w:r>
+        <w:rPr>
+          <w:rtl w:val="0"/>
+        </w:rPr>
+        <w:t xml:space="preserve">4.5. Pruebas realizadas</w:t>
+      </w:r>
+    </w:p>
+    <w:p>
+      <w:pPr>
+        <w:keepNext w:val="0"/>
+        <w:keepLines w:val="0"/>
+        <w:pageBreakBefore w:val="0"/>
+        <w:widowControl w:val="1"/>
+        <w:numPr>
+          <w:ilvl w:val="0"/>
+          <w:numId w:val="1"/>
+        </w:numPr>
+        <w:pBdr>
+          <w:top w:space="0" w:sz="0" w:val="nil"/>
+          <w:left w:space="0" w:sz="0" w:val="nil"/>
+          <w:bottom w:space="0" w:sz="0" w:val="nil"/>
+          <w:right w:space="0" w:sz="0" w:val="nil"/>
+          <w:between w:space="0" w:sz="0" w:val="nil"/>
+        </w:pBdr>
+        <w:shd w:fill="auto" w:val="clear"/>
+        <w:spacing w:after="0" w:before="0" w:line="269" w:lineRule="auto"/>
+        <w:ind w:left="360" w:right="0" w:hanging="360"/>
+        <w:jc w:val="left"/>
+        <w:rPr>
+          <w:b w:val="0"/>
+          <w:bCs w:val="0"/>
+          <w:i w:val="0"/>
+          <w:iCs w:val="0"/>
+          <w:smallCaps w:val="0"/>
+          <w:strike w:val="0"/>
+          <w:color w:val="000000"/>
+          <w:sz w:val="21"/>
+          <w:szCs w:val="21"/>
+          <w:u w:val="none"/>
+          <w:shd w:fill="auto" w:val="clear"/>
+          <w:vertAlign w:val="baseline"/>
+        </w:rPr>
+      </w:pPr>
+      <w:r>
+        <w:rPr>
+          <w:rFonts w:ascii="Arial" w:cs="Arial" w:eastAsia="Arial" w:hAnsi="Arial"/>
+          <w:b w:val="1"/>
+          <w:bCs w:val="1"/>
+          <w:i w:val="0"/>
+          <w:iCs w:val="0"/>
+          <w:smallCaps w:val="0"/>
+          <w:strike w:val="0"/>
+          <w:color w:val="000000"/>
+          <w:sz w:val="21"/>
+          <w:szCs w:val="21"/>
+          <w:u w:val="none"/>
+          <w:shd w:fill="auto" w:val="clear"/>
+          <w:vertAlign w:val="baseline"/>
+          <w:rtl w:val="0"/>
+        </w:rPr>
+        <w:t xml:space="preserve">Datos guardados: </w:t>
+      </w:r>
+      <w:r>
+        <w:rPr>
+          <w:rFonts w:ascii="Arial" w:cs="Arial" w:eastAsia="Arial" w:hAnsi="Arial"/>
+          <w:b w:val="0"/>
+          <w:bCs w:val="0"/>
+          <w:i w:val="0"/>
+          <w:iCs w:val="0"/>
+          <w:smallCaps w:val="0"/>
+          <w:strike w:val="0"/>
+          <w:color w:val="000000"/>
+          <w:sz w:val="21"/>
+          <w:szCs w:val="21"/>
+          <w:u w:val="none"/>
+          <w:shd w:fill="auto" w:val="clear"/>
+          <w:vertAlign w:val="baseline"/>
+          <w:rtl w:val="0"/>
+        </w:rPr>
+        <w:t xml:space="preserve">carga de los archivos .dat existentes y conservación de los datos al reiniciar.</w:t>
+      </w:r>
+    </w:p>
+    <w:p>
+      <w:pPr>
+        <w:keepNext w:val="0"/>
+        <w:keepLines w:val="0"/>
+        <w:pageBreakBefore w:val="0"/>
+        <w:widowControl w:val="1"/>
+        <w:numPr>
+          <w:ilvl w:val="0"/>
+          <w:numId w:val="1"/>
+        </w:numPr>
+        <w:pBdr>
+          <w:top w:space="0" w:sz="0" w:val="nil"/>
+          <w:left w:space="0" w:sz="0" w:val="nil"/>
+          <w:bottom w:space="0" w:sz="0" w:val="nil"/>
+          <w:right w:space="0" w:sz="0" w:val="nil"/>
+          <w:between w:space="0" w:sz="0" w:val="nil"/>
+        </w:pBdr>
+        <w:shd w:fill="auto" w:val="clear"/>
+        <w:spacing w:after="0" w:before="0" w:line="269" w:lineRule="auto"/>
+        <w:ind w:left="360" w:right="0" w:hanging="360"/>
+        <w:jc w:val="left"/>
+        <w:rPr>
+          <w:b w:val="0"/>
+          <w:bCs w:val="0"/>
+          <w:i w:val="0"/>
+          <w:iCs w:val="0"/>
+          <w:smallCaps w:val="0"/>
+          <w:strike w:val="0"/>
+          <w:color w:val="000000"/>
+          <w:sz w:val="21"/>
+          <w:szCs w:val="21"/>
+          <w:u w:val="none"/>
+          <w:shd w:fill="auto" w:val="clear"/>
+          <w:vertAlign w:val="baseline"/>
+        </w:rPr>
+      </w:pPr>
+      <w:r>
+        <w:rPr>
+          <w:rFonts w:ascii="Arial" w:cs="Arial" w:eastAsia="Arial" w:hAnsi="Arial"/>
+          <w:b w:val="1"/>
+          <w:bCs w:val="1"/>
+          <w:i w:val="0"/>
+          <w:iCs w:val="0"/>
+          <w:smallCaps w:val="0"/>
+          <w:strike w:val="0"/>
+          <w:color w:val="000000"/>
+          <w:sz w:val="21"/>
+          <w:szCs w:val="21"/>
+          <w:u w:val="none"/>
+          <w:shd w:fill="auto" w:val="clear"/>
+          <w:vertAlign w:val="baseline"/>
+          <w:rtl w:val="0"/>
+        </w:rPr>
+        <w:t xml:space="preserve">Funcionamiento sin cambios: </w:t>
+      </w:r>
+      <w:r>
+        <w:rPr>
+          <w:rFonts w:ascii="Arial" w:cs="Arial" w:eastAsia="Arial" w:hAnsi="Arial"/>
+          <w:b w:val="0"/>
+          <w:bCs w:val="0"/>
+          <w:i w:val="0"/>
+          <w:iCs w:val="0"/>
+          <w:smallCaps w:val="0"/>
+          <w:strike w:val="0"/>
+          <w:color w:val="000000"/>
+          <w:sz w:val="21"/>
+          <w:szCs w:val="21"/>
+          <w:u w:val="none"/>
+          <w:shd w:fill="auto" w:val="clear"/>
+          <w:vertAlign w:val="baseline"/>
+          <w:rtl w:val="0"/>
+        </w:rPr>
+        <w:t xml:space="preserve">alta, modificación y baja de pacientes, odontólogos y turnos, con los mismos resultados y mensajes que la versión anterior; rechazo de turnos en un horario ocupado, de fechas mal escritas y de rangos de fechas invertidos.</w:t>
+      </w:r>
+    </w:p>
+    <w:p>
+      <w:pPr>
+        <w:keepNext w:val="0"/>
+        <w:keepLines w:val="0"/>
+        <w:pageBreakBefore w:val="0"/>
+        <w:widowControl w:val="1"/>
+        <w:numPr>
+          <w:ilvl w:val="0"/>
+          <w:numId w:val="1"/>
+        </w:numPr>
+        <w:pBdr>
+          <w:top w:space="0" w:sz="0" w:val="nil"/>
+          <w:left w:space="0" w:sz="0" w:val="nil"/>
+          <w:bottom w:space="0" w:sz="0" w:val="nil"/>
+          <w:right w:space="0" w:sz="0" w:val="nil"/>
+          <w:between w:space="0" w:sz="0" w:val="nil"/>
+        </w:pBdr>
+        <w:shd w:fill="auto" w:val="clear"/>
+        <w:spacing w:after="0" w:before="0" w:line="269" w:lineRule="auto"/>
+        <w:ind w:left="360" w:right="0" w:hanging="360"/>
+        <w:jc w:val="left"/>
+        <w:rPr>
+          <w:b w:val="0"/>
+          <w:bCs w:val="0"/>
+          <w:i w:val="0"/>
+          <w:iCs w:val="0"/>
+          <w:smallCaps w:val="0"/>
+          <w:strike w:val="0"/>
+          <w:color w:val="000000"/>
+          <w:sz w:val="21"/>
+          <w:szCs w:val="21"/>
+          <w:u w:val="none"/>
+          <w:shd w:fill="auto" w:val="clear"/>
+          <w:vertAlign w:val="baseline"/>
+        </w:rPr>
+      </w:pPr>
+      <w:r>
+        <w:rPr>
+          <w:rFonts w:ascii="Arial" w:cs="Arial" w:eastAsia="Arial" w:hAnsi="Arial"/>
+          <w:b w:val="1"/>
+          <w:bCs w:val="1"/>
+          <w:i w:val="0"/>
+          <w:iCs w:val="0"/>
+          <w:smallCaps w:val="0"/>
+          <w:strike w:val="0"/>
+          <w:color w:val="000000"/>
+          <w:sz w:val="21"/>
+          <w:szCs w:val="21"/>
+          <w:u w:val="none"/>
+          <w:shd w:fill="auto" w:val="clear"/>
+          <w:vertAlign w:val="baseline"/>
+          <w:rtl w:val="0"/>
+        </w:rPr>
         <w:t xml:space="preserve">Domicilio: </w:t>
       </w:r>
       <w:r>
@@ -4545,6 +5168,81 @@
     </w:p>
     <w:p>
       <w:pPr>
+        <w:keepNext w:val="0"/>
+        <w:keepLines w:val="0"/>
+        <w:pageBreakBefore w:val="0"/>
+        <w:widowControl w:val="1"/>
+        <w:numPr>
+          <w:ilvl w:val="0"/>
+          <w:numId w:val="1"/>
+        </w:numPr>
+        <w:pBdr>
+          <w:top w:space="0" w:sz="0" w:val="nil"/>
+          <w:left w:space="0" w:sz="0" w:val="nil"/>
+          <w:bottom w:space="0" w:sz="0" w:val="nil"/>
+          <w:right w:space="0" w:sz="0" w:val="nil"/>
+          <w:between w:space="0" w:sz="0" w:val="nil"/>
+        </w:pBdr>
+        <w:shd w:fill="auto" w:val="clear"/>
+        <w:spacing w:after="0" w:before="0" w:line="269" w:lineRule="auto"/>
+        <w:ind w:left="360" w:right="0" w:hanging="360"/>
+        <w:jc w:val="left"/>
+        <w:rPr>
+          <w:b w:val="0"/>
+          <w:bCs w:val="0"/>
+          <w:i w:val="0"/>
+          <w:iCs w:val="0"/>
+          <w:smallCaps w:val="0"/>
+          <w:strike w:val="0"/>
+          <w:color w:val="000000"/>
+          <w:sz w:val="21"/>
+          <w:szCs w:val="21"/>
+          <w:u w:val="none"/>
+          <w:shd w:fill="auto" w:val="clear"/>
+          <w:vertAlign w:val="baseline"/>
+        </w:rPr>
+      </w:pPr>
+      <w:r>
+        <w:rPr>
+          <w:rFonts w:ascii="Arial" w:cs="Arial" w:eastAsia="Arial" w:hAnsi="Arial"/>
+          <w:b w:val="1"/>
+          <w:bCs w:val="1"/>
+          <w:i w:val="0"/>
+          <w:iCs w:val="0"/>
+          <w:smallCaps w:val="0"/>
+          <w:strike w:val="0"/>
+          <w:color w:val="000000"/>
+          <w:sz w:val="21"/>
+          <w:szCs w:val="21"/>
+          <w:u w:val="none"/>
+          <w:shd w:fill="auto" w:val="clear"/>
+          <w:vertAlign w:val="baseline"/>
+          <w:rtl w:val="0"/>
+        </w:rPr>
+        <w:t xml:space="preserve">Correcciones: </w:t>
+      </w:r>
+      <w:r>
+        <w:rPr>
+          <w:rFonts w:ascii="Arial" w:cs="Arial" w:eastAsia="Arial" w:hAnsi="Arial"/>
+          <w:b w:val="0"/>
+          <w:bCs w:val="0"/>
+          <w:i w:val="0"/>
+          <w:iCs w:val="0"/>
+          <w:smallCaps w:val="0"/>
+          <w:strike w:val="0"/>
+          <w:color w:val="000000"/>
+          <w:sz w:val="21"/>
+          <w:szCs w:val="21"/>
+          <w:u w:val="none"/>
+          <w:shd w:fill="auto" w:val="clear"/>
+          <w:vertAlign w:val="baseline"/>
+          <w:rtl w:val="0"/>
+        </w:rPr>
+        <w:t xml:space="preserve">reservas superpuestas por duración, turnos cancelados, fechas pasadas, domingos y horarios fuera de atención, bajas con turnos, datos después de reiniciar y pantallas de turnos y odontólogos, verificando que cada caso se comporte como se describe en 4.4.</w:t>
+      </w:r>
+    </w:p>
+    <w:p>
+      <w:pPr>
         <w:pStyle w:val="Heading2"/>
         <w:rPr/>
       </w:pPr>
@@ -4552,7 +5250,7 @@
         <w:rPr>
           <w:rtl w:val="0"/>
         </w:rPr>
-        <w:t xml:space="preserve">4.5. Estado de los requerimientos</w:t>
+        <w:t xml:space="preserve">4.6. Estado de los requerimientos</w:t>
       </w:r>
     </w:p>
     <w:p>
@@ -4570,7 +5268,7 @@
         <w:rPr>
           <w:rtl w:val="0"/>
         </w:rPr>
-        <w:t xml:space="preserve">Los requerimientos RF01 a RF08 de la Entrega 1 siguen pendientes. Para las próximas entregas está previsto incorporarlos junto con los patrones de diseño que se vean en la cursada (por ejemplo, Factory y Singleton).</w:t>
+        <w:t xml:space="preserve">Con las correcciones quedó implementado el RF04 (horario hábil de la clínica, de lunes a sábado de 08:00 a 20:00). Los demás requerimientos (RF01 a RF03 y RF05 a RF08) siguen pendientes. Para las próximas entregas está previsto incorporarlos junto con los patrones de diseño que se vean en la cursada; por ejemplo, el patrón State para controlar los cambios de estado de los turnos.</w:t>
       </w:r>
     </w:p>
     <w:p>
@@ -4675,7 +5373,7 @@
         <w:rPr/>
         <w:drawing>
           <wp:inline distB="0" distT="0" distL="0" distR="0">
-            <wp:extent cx="6152029" cy="5577840"/>
+            <wp:extent cx="7161488" cy="5577840"/>
             <wp:effectExtent b="0" l="0" r="0" t="0"/>
             <wp:docPr id="3" name="diagrama_v6.png"/>
             <a:graphic>
@@ -4695,7 +5393,7 @@
                   <pic:spPr>
                     <a:xfrm>
                       <a:off x="0" y="0"/>
-                      <a:ext cx="6152029" cy="5577840"/>
+                      <a:ext cx="7161488" cy="5577840"/>
                     </a:xfrm>
                     <a:prstGeom prst="rect"/>
                     <a:ln/>

</xml_diff>

<commit_message>
Informe: code smells y patrones GRASP (Entrega 2)
</commit_message>
<xml_diff>
--- a/docs/Sonrisa Feliz Informe Academico.docx
+++ b/docs/Sonrisa Feliz Informe Academico.docx
@@ -3571,18 +3571,1327 @@
         <w:rPr>
           <w:rtl w:val="0"/>
         </w:rPr>
-        <w:t xml:space="preserve">4.1. Reestructuración del código (GRASP y SOLID)</w:t>
-      </w:r>
-    </w:p>
-    <w:p>
-      <w:pPr>
-        <w:rPr/>
-      </w:pPr>
-      <w:r>
-        <w:rPr>
-          <w:rtl w:val="0"/>
-        </w:rPr>
-        <w:t xml:space="preserve">El programa quedó separado en capas (MVC): Vista → Controlador → Servicio → Persistencia. Los cambios principales fueron:</w:t>
+        <w:t xml:space="preserve">4.1. Code smells detectados y su corrección</w:t>
+      </w:r>
+    </w:p>
+    <w:p>
+      <w:pPr>
+        <w:rPr/>
+      </w:pPr>
+      <w:r>
+        <w:rPr>
+          <w:rtl w:val="0"/>
+        </w:rPr>
+        <w:t xml:space="preserve">Se partió de la revisión de code smells hecha en la Entrega 1 y se revisó el código completo. La tabla resume cada smell, cómo estaba en la versión anterior, qué se cambió y por qué ese cambio lo corrige. Estos cambios no modifican el funcionamiento del programa.</w:t>
+      </w:r>
+    </w:p>
+    <w:tbl>
+      <w:tblPr>
+        <w:tblW w:w="8958" w:type="dxa"/>
+        <w:tblBorders>
+          <w:top w:val="single" w:sz="4" w:space="0" w:color="999999"/>
+          <w:left w:val="single" w:sz="4" w:space="0" w:color="999999"/>
+          <w:bottom w:val="single" w:sz="4" w:space="0" w:color="999999"/>
+          <w:right w:val="single" w:sz="4" w:space="0" w:color="999999"/>
+          <w:insideH w:val="single" w:sz="4" w:space="0" w:color="999999"/>
+          <w:insideV w:val="single" w:sz="4" w:space="0" w:color="999999"/>
+        </w:tblBorders>
+        <w:tblLayout w:type="fixed"/>
+        <w:tblCellMar>
+          <w:top w:w="50" w:type="dxa"/>
+          <w:left w:w="80" w:type="dxa"/>
+          <w:bottom w:w="30" w:type="dxa"/>
+          <w:right w:w="80" w:type="dxa"/>
+        </w:tblCellMar>
+      </w:tblPr>
+      <w:tblGrid>
+        <w:gridCol w:w="1850"/>
+        <w:gridCol w:w="2400"/>
+        <w:gridCol w:w="2400"/>
+        <w:gridCol w:w="2308"/>
+      </w:tblGrid>
+      <w:tr>
+        <w:trPr>
+          <w:cantSplit/>
+          <w:tblHeader/>
+        </w:trPr>
+        <w:tc>
+          <w:tcPr>
+            <w:tcW w:w="1850" w:type="dxa"/>
+            <w:shd w:val="clear" w:color="auto" w:fill="D9E2F3"/>
+          </w:tcPr>
+          <w:p>
+            <w:pPr>
+              <w:spacing w:before="0" w:after="40" w:line="240" w:lineRule="auto"/>
+            </w:pPr>
+            <w:r>
+              <w:rPr>
+                <w:b/>
+                <w:bCs/>
+                <w:sz w:val="17"/>
+                <w:szCs w:val="17"/>
+              </w:rPr>
+              <w:t xml:space="preserve">Code smell</w:t>
+            </w:r>
+          </w:p>
+        </w:tc>
+        <w:tc>
+          <w:tcPr>
+            <w:tcW w:w="2400" w:type="dxa"/>
+            <w:shd w:val="clear" w:color="auto" w:fill="D9E2F3"/>
+          </w:tcPr>
+          <w:p>
+            <w:pPr>
+              <w:spacing w:before="0" w:after="40" w:line="240" w:lineRule="auto"/>
+            </w:pPr>
+            <w:r>
+              <w:rPr>
+                <w:b/>
+                <w:bCs/>
+                <w:sz w:val="17"/>
+                <w:szCs w:val="17"/>
+              </w:rPr>
+              <w:t xml:space="preserve">Versión anterior</w:t>
+            </w:r>
+          </w:p>
+        </w:tc>
+        <w:tc>
+          <w:tcPr>
+            <w:tcW w:w="2400" w:type="dxa"/>
+            <w:shd w:val="clear" w:color="auto" w:fill="D9E2F3"/>
+          </w:tcPr>
+          <w:p>
+            <w:pPr>
+              <w:spacing w:before="0" w:after="40" w:line="240" w:lineRule="auto"/>
+            </w:pPr>
+            <w:r>
+              <w:rPr>
+                <w:b/>
+                <w:bCs/>
+                <w:sz w:val="17"/>
+                <w:szCs w:val="17"/>
+              </w:rPr>
+              <w:t xml:space="preserve">Corrección</w:t>
+            </w:r>
+          </w:p>
+        </w:tc>
+        <w:tc>
+          <w:tcPr>
+            <w:tcW w:w="2308" w:type="dxa"/>
+            <w:shd w:val="clear" w:color="auto" w:fill="D9E2F3"/>
+          </w:tcPr>
+          <w:p>
+            <w:pPr>
+              <w:spacing w:before="0" w:after="40" w:line="240" w:lineRule="auto"/>
+            </w:pPr>
+            <w:r>
+              <w:rPr>
+                <w:b/>
+                <w:bCs/>
+                <w:sz w:val="17"/>
+                <w:szCs w:val="17"/>
+              </w:rPr>
+              <w:t xml:space="preserve">Por qué queda corregido</w:t>
+            </w:r>
+          </w:p>
+        </w:tc>
+      </w:tr>
+      <w:tr>
+        <w:trPr>
+          <w:cantSplit/>
+        </w:trPr>
+        <w:tc>
+          <w:tcPr>
+            <w:tcW w:w="1850" w:type="dxa"/>
+          </w:tcPr>
+          <w:p>
+            <w:pPr>
+              <w:spacing w:before="0" w:after="40" w:line="240" w:lineRule="auto"/>
+            </w:pPr>
+            <w:r>
+              <w:rPr>
+                <w:b/>
+                <w:bCs/>
+                <w:sz w:val="17"/>
+                <w:szCs w:val="17"/>
+              </w:rPr>
+              <w:t xml:space="preserve">Código duplicado</w:t>
+            </w:r>
+            <w:r>
+              <w:rPr>
+                <w:sz w:val="17"/>
+                <w:szCs w:val="17"/>
+              </w:rPr>
+              <w:t xml:space="preserve"> (persistencia)</w:t>
+            </w:r>
+          </w:p>
+        </w:tc>
+        <w:tc>
+          <w:tcPr>
+            <w:tcW w:w="2400" w:type="dxa"/>
+          </w:tcPr>
+          <w:p>
+            <w:pPr>
+              <w:spacing w:before="0" w:after="40" w:line="240" w:lineRule="auto"/>
+            </w:pPr>
+            <w:r>
+              <w:rPr>
+                <w:sz w:val="17"/>
+                <w:szCs w:val="17"/>
+              </w:rPr>
+              <w:t xml:space="preserve">RepoPaciente, RepoOdonto y RepoTurno repetían el mismo código: ruta del archivo, lectura y escritura del .dat y las operaciones sobre el Map.</w:t>
+            </w:r>
+          </w:p>
+        </w:tc>
+        <w:tc>
+          <w:tcPr>
+            <w:tcW w:w="2400" w:type="dxa"/>
+          </w:tcPr>
+          <w:p>
+            <w:pPr>
+              <w:spacing w:before="0" w:after="40" w:line="240" w:lineRule="auto"/>
+            </w:pPr>
+            <w:r>
+              <w:rPr>
+                <w:sz w:val="17"/>
+                <w:szCs w:val="17"/>
+              </w:rPr>
+              <w:t xml:space="preserve">Clase abstracta RepoArchivo&lt;T, ID&gt; con ese código. Cada repositorio solo implementa obtenerId() para indicar su clave (DNI, matrícula o ID).</w:t>
+            </w:r>
+          </w:p>
+        </w:tc>
+        <w:tc>
+          <w:tcPr>
+            <w:tcW w:w="2308" w:type="dxa"/>
+          </w:tcPr>
+          <w:p>
+            <w:pPr>
+              <w:spacing w:before="0" w:after="40" w:line="240" w:lineRule="auto"/>
+            </w:pPr>
+            <w:r>
+              <w:rPr>
+                <w:sz w:val="17"/>
+                <w:szCs w:val="17"/>
+              </w:rPr>
+              <w:t xml:space="preserve">El código está en un solo lugar (DRY). Para agregar un repositorio se extiende la clase base sin copiar ni modificar código existente (OCP).</w:t>
+            </w:r>
+          </w:p>
+        </w:tc>
+      </w:tr>
+      <w:tr>
+        <w:trPr>
+          <w:cantSplit/>
+        </w:trPr>
+        <w:tc>
+          <w:tcPr>
+            <w:tcW w:w="1850" w:type="dxa"/>
+          </w:tcPr>
+          <w:p>
+            <w:pPr>
+              <w:spacing w:before="0" w:after="40" w:line="240" w:lineRule="auto"/>
+            </w:pPr>
+            <w:r>
+              <w:rPr>
+                <w:b/>
+                <w:bCs/>
+                <w:sz w:val="17"/>
+                <w:szCs w:val="17"/>
+              </w:rPr>
+              <w:t xml:space="preserve">Código duplicado</w:t>
+            </w:r>
+            <w:r>
+              <w:rPr>
+                <w:sz w:val="17"/>
+                <w:szCs w:val="17"/>
+              </w:rPr>
+              <w:t xml:space="preserve"> (lógica de negocio)</w:t>
+            </w:r>
+          </w:p>
+        </w:tc>
+        <w:tc>
+          <w:tcPr>
+            <w:tcW w:w="2400" w:type="dxa"/>
+          </w:tcPr>
+          <w:p>
+            <w:pPr>
+              <w:spacing w:before="0" w:after="40" w:line="240" w:lineRule="auto"/>
+            </w:pPr>
+            <w:r>
+              <w:rPr>
+                <w:sz w:val="17"/>
+                <w:szCs w:val="17"/>
+              </w:rPr>
+              <w:t xml:space="preserve">El control de horario ocupado estaba copiado en crearTurno y actualizarTurno; el aviso de turno inexistente, en 4 métodos; y la validación de nombre, apellido y e-mail, en el alta y la modificación de pacientes.</w:t>
+            </w:r>
+          </w:p>
+        </w:tc>
+        <w:tc>
+          <w:tcPr>
+            <w:tcW w:w="2400" w:type="dxa"/>
+          </w:tcPr>
+          <w:p>
+            <w:pPr>
+              <w:spacing w:before="0" w:after="40" w:line="240" w:lineRule="auto"/>
+            </w:pPr>
+            <w:r>
+              <w:rPr>
+                <w:sz w:val="17"/>
+                <w:szCs w:val="17"/>
+              </w:rPr>
+              <w:t xml:space="preserve">Métodos privados reutilizables: verificarHorarioLibre(), buscar(id) y validarDatosPersonales().</w:t>
+            </w:r>
+          </w:p>
+        </w:tc>
+        <w:tc>
+          <w:tcPr>
+            <w:tcW w:w="2308" w:type="dxa"/>
+          </w:tcPr>
+          <w:p>
+            <w:pPr>
+              <w:spacing w:before="0" w:after="40" w:line="240" w:lineRule="auto"/>
+            </w:pPr>
+            <w:r>
+              <w:rPr>
+                <w:sz w:val="17"/>
+                <w:szCs w:val="17"/>
+              </w:rPr>
+              <w:t xml:space="preserve">Cada regla se escribe una vez: si cambia, se modifica en un único método y no puede quedar distinta en un lugar y en otro.</w:t>
+            </w:r>
+          </w:p>
+        </w:tc>
+      </w:tr>
+      <w:tr>
+        <w:trPr>
+          <w:cantSplit/>
+        </w:trPr>
+        <w:tc>
+          <w:tcPr>
+            <w:tcW w:w="1850" w:type="dxa"/>
+          </w:tcPr>
+          <w:p>
+            <w:pPr>
+              <w:spacing w:before="0" w:after="40" w:line="240" w:lineRule="auto"/>
+            </w:pPr>
+            <w:r>
+              <w:rPr>
+                <w:b/>
+                <w:bCs/>
+                <w:sz w:val="17"/>
+                <w:szCs w:val="17"/>
+              </w:rPr>
+              <w:t xml:space="preserve">Código duplicado</w:t>
+            </w:r>
+            <w:r>
+              <w:rPr>
+                <w:sz w:val="17"/>
+                <w:szCs w:val="17"/>
+              </w:rPr>
+              <w:t xml:space="preserve"> (creación de odontólogos)</w:t>
+            </w:r>
+          </w:p>
+        </w:tc>
+        <w:tc>
+          <w:tcPr>
+            <w:tcW w:w="2400" w:type="dxa"/>
+          </w:tcPr>
+          <w:p>
+            <w:pPr>
+              <w:spacing w:before="0" w:after="40" w:line="240" w:lineRule="auto"/>
+            </w:pPr>
+            <w:r>
+              <w:rPr>
+                <w:sz w:val="17"/>
+                <w:szCs w:val="17"/>
+              </w:rPr>
+              <w:t xml:space="preserve">El switch que crea Endodoncista, Ortodoncista, etc. según la especialidad estaba en OdontologoPanel y en el controlador de consola.</w:t>
+            </w:r>
+          </w:p>
+        </w:tc>
+        <w:tc>
+          <w:tcPr>
+            <w:tcW w:w="2400" w:type="dxa"/>
+          </w:tcPr>
+          <w:p>
+            <w:pPr>
+              <w:spacing w:before="0" w:after="40" w:line="240" w:lineRule="auto"/>
+            </w:pPr>
+            <w:r>
+              <w:rPr>
+                <w:sz w:val="17"/>
+                <w:szCs w:val="17"/>
+              </w:rPr>
+              <w:t xml:space="preserve">Un único switch en OdontologoController (en la próxima entrega se reemplaza por un Factory).</w:t>
+            </w:r>
+          </w:p>
+        </w:tc>
+        <w:tc>
+          <w:tcPr>
+            <w:tcW w:w="2308" w:type="dxa"/>
+          </w:tcPr>
+          <w:p>
+            <w:pPr>
+              <w:spacing w:before="0" w:after="40" w:line="240" w:lineRule="auto"/>
+            </w:pPr>
+            <w:r>
+              <w:rPr>
+                <w:sz w:val="17"/>
+                <w:szCs w:val="17"/>
+              </w:rPr>
+              <w:t xml:space="preserve">Hay un solo punto de creación de odontólogos (patrón Creador).</w:t>
+            </w:r>
+          </w:p>
+        </w:tc>
+      </w:tr>
+      <w:tr>
+        <w:trPr>
+          <w:cantSplit/>
+        </w:trPr>
+        <w:tc>
+          <w:tcPr>
+            <w:tcW w:w="1850" w:type="dxa"/>
+          </w:tcPr>
+          <w:p>
+            <w:pPr>
+              <w:spacing w:before="0" w:after="40" w:line="240" w:lineRule="auto"/>
+            </w:pPr>
+            <w:r>
+              <w:rPr>
+                <w:b/>
+                <w:bCs/>
+                <w:sz w:val="17"/>
+                <w:szCs w:val="17"/>
+              </w:rPr>
+              <w:t xml:space="preserve">Clase con demasiadas responsabilidades</w:t>
+            </w:r>
+            <w:r>
+              <w:rPr>
+                <w:sz w:val="17"/>
+                <w:szCs w:val="17"/>
+              </w:rPr>
+              <w:t xml:space="preserve"> en las vistas</w:t>
+            </w:r>
+          </w:p>
+        </w:tc>
+        <w:tc>
+          <w:tcPr>
+            <w:tcW w:w="2400" w:type="dxa"/>
+          </w:tcPr>
+          <w:p>
+            <w:pPr>
+              <w:spacing w:before="0" w:after="40" w:line="240" w:lineRule="auto"/>
+            </w:pPr>
+            <w:r>
+              <w:rPr>
+                <w:sz w:val="17"/>
+                <w:szCs w:val="17"/>
+              </w:rPr>
+              <w:t xml:space="preserve">Los paneles Swing, además de mostrar datos, creaban objetos del modelo (new Paciente, new Turno), convertían fechas y horas y llamaban directamente a los servicios (TurnoPanel dependía de 3 servicios).</w:t>
+            </w:r>
+          </w:p>
+        </w:tc>
+        <w:tc>
+          <w:tcPr>
+            <w:tcW w:w="2400" w:type="dxa"/>
+          </w:tcPr>
+          <w:p>
+            <w:pPr>
+              <w:spacing w:before="0" w:after="40" w:line="240" w:lineRule="auto"/>
+            </w:pPr>
+            <w:r>
+              <w:rPr>
+                <w:sz w:val="17"/>
+                <w:szCs w:val="17"/>
+              </w:rPr>
+              <w:t xml:space="preserve">Se agregaron PacienteController, OdontologoController y TurnoController: la vista les pasa los datos y el controlador crea los objetos y llama al servicio.</w:t>
+            </w:r>
+          </w:p>
+        </w:tc>
+        <w:tc>
+          <w:tcPr>
+            <w:tcW w:w="2308" w:type="dxa"/>
+          </w:tcPr>
+          <w:p>
+            <w:pPr>
+              <w:spacing w:before="0" w:after="40" w:line="240" w:lineRule="auto"/>
+            </w:pPr>
+            <w:r>
+              <w:rPr>
+                <w:sz w:val="17"/>
+                <w:szCs w:val="17"/>
+              </w:rPr>
+              <w:t xml:space="preserve">Cada capa tiene una responsabilidad (SRP, MVC). La vista depende de un solo controlador (bajo acoplamiento) y puede cambiarse sin tocar la lógica.</w:t>
+            </w:r>
+          </w:p>
+        </w:tc>
+      </w:tr>
+      <w:tr>
+        <w:trPr>
+          <w:cantSplit/>
+        </w:trPr>
+        <w:tc>
+          <w:tcPr>
+            <w:tcW w:w="1850" w:type="dxa"/>
+          </w:tcPr>
+          <w:p>
+            <w:pPr>
+              <w:spacing w:before="0" w:after="40" w:line="240" w:lineRule="auto"/>
+            </w:pPr>
+            <w:r>
+              <w:rPr>
+                <w:b/>
+                <w:bCs/>
+                <w:sz w:val="17"/>
+                <w:szCs w:val="17"/>
+              </w:rPr>
+              <w:t xml:space="preserve">Responsabilidad fuera de lugar</w:t>
+            </w:r>
+            <w:r>
+              <w:rPr>
+                <w:sz w:val="17"/>
+                <w:szCs w:val="17"/>
+              </w:rPr>
+              <w:t xml:space="preserve"> en MainFrame</w:t>
+            </w:r>
+          </w:p>
+        </w:tc>
+        <w:tc>
+          <w:tcPr>
+            <w:tcW w:w="2400" w:type="dxa"/>
+          </w:tcPr>
+          <w:p>
+            <w:pPr>
+              <w:spacing w:before="0" w:after="40" w:line="240" w:lineRule="auto"/>
+            </w:pPr>
+            <w:r>
+              <w:rPr>
+                <w:sz w:val="17"/>
+                <w:szCs w:val="17"/>
+              </w:rPr>
+              <w:t xml:space="preserve">La ventana principal creaba los repositorios y los servicios del sistema.</w:t>
+            </w:r>
+          </w:p>
+        </w:tc>
+        <w:tc>
+          <w:tcPr>
+            <w:tcW w:w="2400" w:type="dxa"/>
+          </w:tcPr>
+          <w:p>
+            <w:pPr>
+              <w:spacing w:before="0" w:after="40" w:line="240" w:lineRule="auto"/>
+            </w:pPr>
+            <w:r>
+              <w:rPr>
+                <w:sz w:val="17"/>
+                <w:szCs w:val="17"/>
+              </w:rPr>
+              <w:t xml:space="preserve">Main arma los repositorios, servicios y controladores y se los pasa a MainFrame.</w:t>
+            </w:r>
+          </w:p>
+        </w:tc>
+        <w:tc>
+          <w:tcPr>
+            <w:tcW w:w="2308" w:type="dxa"/>
+          </w:tcPr>
+          <w:p>
+            <w:pPr>
+              <w:spacing w:before="0" w:after="40" w:line="240" w:lineRule="auto"/>
+            </w:pPr>
+            <w:r>
+              <w:rPr>
+                <w:sz w:val="17"/>
+                <w:szCs w:val="17"/>
+              </w:rPr>
+              <w:t xml:space="preserve">MainFrame solo se ocupa de la ventana y la navegación (SRP, alta cohesión).</w:t>
+            </w:r>
+          </w:p>
+        </w:tc>
+      </w:tr>
+      <w:tr>
+        <w:trPr>
+          <w:cantSplit/>
+        </w:trPr>
+        <w:tc>
+          <w:tcPr>
+            <w:tcW w:w="1850" w:type="dxa"/>
+          </w:tcPr>
+          <w:p>
+            <w:pPr>
+              <w:spacing w:before="0" w:after="40" w:line="240" w:lineRule="auto"/>
+            </w:pPr>
+            <w:r>
+              <w:rPr>
+                <w:b/>
+                <w:bCs/>
+                <w:sz w:val="17"/>
+                <w:szCs w:val="17"/>
+              </w:rPr>
+              <w:t xml:space="preserve">Controladores acoplados a la consola / código muerto</w:t>
+            </w:r>
+          </w:p>
+        </w:tc>
+        <w:tc>
+          <w:tcPr>
+            <w:tcW w:w="2400" w:type="dxa"/>
+          </w:tcPr>
+          <w:p>
+            <w:pPr>
+              <w:spacing w:before="0" w:after="40" w:line="240" w:lineRule="auto"/>
+            </w:pPr>
+            <w:r>
+              <w:rPr>
+                <w:sz w:val="17"/>
+                <w:szCs w:val="17"/>
+              </w:rPr>
+              <w:t xml:space="preserve">Los Controller usaban Scanner y System.out para un menú de consola que la interfaz gráfica no utilizaba.</w:t>
+            </w:r>
+          </w:p>
+        </w:tc>
+        <w:tc>
+          <w:tcPr>
+            <w:tcW w:w="2400" w:type="dxa"/>
+          </w:tcPr>
+          <w:p>
+            <w:pPr>
+              <w:spacing w:before="0" w:after="40" w:line="240" w:lineRule="auto"/>
+            </w:pPr>
+            <w:r>
+              <w:rPr>
+                <w:sz w:val="17"/>
+                <w:szCs w:val="17"/>
+              </w:rPr>
+              <w:t xml:space="preserve">Se eliminaron y se reemplazaron por los controladores de la interfaz gráfica.</w:t>
+            </w:r>
+          </w:p>
+        </w:tc>
+        <w:tc>
+          <w:tcPr>
+            <w:tcW w:w="2308" w:type="dxa"/>
+          </w:tcPr>
+          <w:p>
+            <w:pPr>
+              <w:spacing w:before="0" w:after="40" w:line="240" w:lineRule="auto"/>
+            </w:pPr>
+            <w:r>
+              <w:rPr>
+                <w:sz w:val="17"/>
+                <w:szCs w:val="17"/>
+              </w:rPr>
+              <w:t xml:space="preserve">No queda código sin uso ni lectura de consola mezclada con la lógica.</w:t>
+            </w:r>
+          </w:p>
+        </w:tc>
+      </w:tr>
+      <w:tr>
+        <w:trPr>
+          <w:cantSplit/>
+        </w:trPr>
+        <w:tc>
+          <w:tcPr>
+            <w:tcW w:w="1850" w:type="dxa"/>
+          </w:tcPr>
+          <w:p>
+            <w:pPr>
+              <w:spacing w:before="0" w:after="40" w:line="240" w:lineRule="auto"/>
+            </w:pPr>
+            <w:r>
+              <w:rPr>
+                <w:b/>
+                <w:bCs/>
+                <w:sz w:val="17"/>
+                <w:szCs w:val="17"/>
+              </w:rPr>
+              <w:t xml:space="preserve">Valores de retorno sin uso</w:t>
+            </w:r>
+            <w:r>
+              <w:rPr>
+                <w:sz w:val="17"/>
+                <w:szCs w:val="17"/>
+              </w:rPr>
+              <w:t xml:space="preserve"> en los servicios</w:t>
+            </w:r>
+          </w:p>
+        </w:tc>
+        <w:tc>
+          <w:tcPr>
+            <w:tcW w:w="2400" w:type="dxa"/>
+          </w:tcPr>
+          <w:p>
+            <w:pPr>
+              <w:spacing w:before="0" w:after="40" w:line="240" w:lineRule="auto"/>
+            </w:pPr>
+            <w:r>
+              <w:rPr>
+                <w:sz w:val="17"/>
+                <w:szCs w:val="17"/>
+              </w:rPr>
+              <w:t xml:space="preserve">Los métodos de alta, modificación y baja devolvían boolean, pero siempre true y nadie usaba el resultado.</w:t>
+            </w:r>
+          </w:p>
+        </w:tc>
+        <w:tc>
+          <w:tcPr>
+            <w:tcW w:w="2400" w:type="dxa"/>
+          </w:tcPr>
+          <w:p>
+            <w:pPr>
+              <w:spacing w:before="0" w:after="40" w:line="240" w:lineRule="auto"/>
+            </w:pPr>
+            <w:r>
+              <w:rPr>
+                <w:sz w:val="17"/>
+                <w:szCs w:val="17"/>
+              </w:rPr>
+              <w:t xml:space="preserve">Los métodos son void y los errores se informan solo con las excepciones del proyecto (por ejemplo, DatoInvalidoException).</w:t>
+            </w:r>
+          </w:p>
+        </w:tc>
+        <w:tc>
+          <w:tcPr>
+            <w:tcW w:w="2308" w:type="dxa"/>
+          </w:tcPr>
+          <w:p>
+            <w:pPr>
+              <w:spacing w:before="0" w:after="40" w:line="240" w:lineRule="auto"/>
+            </w:pPr>
+            <w:r>
+              <w:rPr>
+                <w:sz w:val="17"/>
+                <w:szCs w:val="17"/>
+              </w:rPr>
+              <w:t xml:space="preserve">La firma refleja lo que el método hace y no se puede ignorar un error por no revisar un booleano.</w:t>
+            </w:r>
+          </w:p>
+        </w:tc>
+      </w:tr>
+      <w:tr>
+        <w:trPr>
+          <w:cantSplit/>
+        </w:trPr>
+        <w:tc>
+          <w:tcPr>
+            <w:tcW w:w="1850" w:type="dxa"/>
+          </w:tcPr>
+          <w:p>
+            <w:pPr>
+              <w:spacing w:before="0" w:after="40" w:line="240" w:lineRule="auto"/>
+            </w:pPr>
+            <w:r>
+              <w:rPr>
+                <w:b/>
+                <w:bCs/>
+                <w:sz w:val="17"/>
+                <w:szCs w:val="17"/>
+              </w:rPr>
+              <w:t xml:space="preserve">Datos hardcodeados</w:t>
+            </w:r>
+          </w:p>
+        </w:tc>
+        <w:tc>
+          <w:tcPr>
+            <w:tcW w:w="2400" w:type="dxa"/>
+          </w:tcPr>
+          <w:p>
+            <w:pPr>
+              <w:spacing w:before="0" w:after="40" w:line="240" w:lineRule="auto"/>
+            </w:pPr>
+            <w:r>
+              <w:rPr>
+                <w:sz w:val="17"/>
+                <w:szCs w:val="17"/>
+              </w:rPr>
+              <w:t xml:space="preserve">Al registrar un paciente se guardaba siempre el domicilio fijo "Calle 123, Ciudad, Provincia".</w:t>
+            </w:r>
+          </w:p>
+        </w:tc>
+        <w:tc>
+          <w:tcPr>
+            <w:tcW w:w="2400" w:type="dxa"/>
+          </w:tcPr>
+          <w:p>
+            <w:pPr>
+              <w:spacing w:before="0" w:after="40" w:line="240" w:lineRule="auto"/>
+            </w:pPr>
+            <w:r>
+              <w:rPr>
+                <w:sz w:val="17"/>
+                <w:szCs w:val="17"/>
+              </w:rPr>
+              <w:t xml:space="preserve">El domicilio se carga desde el formulario y se valida.</w:t>
+            </w:r>
+          </w:p>
+        </w:tc>
+        <w:tc>
+          <w:tcPr>
+            <w:tcW w:w="2308" w:type="dxa"/>
+          </w:tcPr>
+          <w:p>
+            <w:pPr>
+              <w:spacing w:before="0" w:after="40" w:line="240" w:lineRule="auto"/>
+            </w:pPr>
+            <w:r>
+              <w:rPr>
+                <w:sz w:val="17"/>
+                <w:szCs w:val="17"/>
+              </w:rPr>
+              <w:t xml:space="preserve">No hay valores fijos en el código: cada paciente guarda su domicilio real.</w:t>
+            </w:r>
+          </w:p>
+        </w:tc>
+      </w:tr>
+    </w:tbl>
+    <w:p>
+      <w:pPr>
+        <w:spacing w:after="0"/>
+        <w:rPr/>
+      </w:pPr>
+      <w:r>
+        <w:rPr>
+          <w:rtl w:val="0"/>
+        </w:rPr>
+        <w:t xml:space="preserve"/>
+      </w:r>
+    </w:p>
+    <w:p>
+      <w:pPr>
+        <w:rPr/>
+      </w:pPr>
+      <w:r>
+        <w:rPr>
+          <w:rtl w:val="0"/>
+        </w:rPr>
+        <w:t xml:space="preserve">De la revisión anterior, los tipos genéricos en IRepositorio y la sincronización del contador de IDs al leer los archivos .dat ya estaban resueltos en la versión recibida, por lo que no requirieron cambios.</w:t>
+      </w:r>
+    </w:p>
+    <w:p>
+      <w:pPr>
+        <w:pStyle w:val="Heading2"/>
+        <w:rPr/>
+      </w:pPr>
+      <w:r>
+        <w:rPr>
+          <w:rtl w:val="0"/>
+        </w:rPr>
+        <w:t xml:space="preserve">4.2. Patrones GRASP aplicados</w:t>
+      </w:r>
+    </w:p>
+    <w:tbl>
+      <w:tblPr>
+        <w:tblW w:w="8958" w:type="dxa"/>
+        <w:tblBorders>
+          <w:top w:val="single" w:sz="4" w:space="0" w:color="999999"/>
+          <w:left w:val="single" w:sz="4" w:space="0" w:color="999999"/>
+          <w:bottom w:val="single" w:sz="4" w:space="0" w:color="999999"/>
+          <w:right w:val="single" w:sz="4" w:space="0" w:color="999999"/>
+          <w:insideH w:val="single" w:sz="4" w:space="0" w:color="999999"/>
+          <w:insideV w:val="single" w:sz="4" w:space="0" w:color="999999"/>
+        </w:tblBorders>
+        <w:tblLayout w:type="fixed"/>
+        <w:tblCellMar>
+          <w:top w:w="50" w:type="dxa"/>
+          <w:left w:w="80" w:type="dxa"/>
+          <w:bottom w:w="30" w:type="dxa"/>
+          <w:right w:w="80" w:type="dxa"/>
+        </w:tblCellMar>
+      </w:tblPr>
+      <w:tblGrid>
+        <w:gridCol w:w="1700"/>
+        <w:gridCol w:w="2600"/>
+        <w:gridCol w:w="4658"/>
+      </w:tblGrid>
+      <w:tr>
+        <w:trPr>
+          <w:cantSplit/>
+          <w:tblHeader/>
+        </w:trPr>
+        <w:tc>
+          <w:tcPr>
+            <w:tcW w:w="1700" w:type="dxa"/>
+            <w:shd w:val="clear" w:color="auto" w:fill="D9E2F3"/>
+          </w:tcPr>
+          <w:p>
+            <w:pPr>
+              <w:spacing w:before="0" w:after="40" w:line="240" w:lineRule="auto"/>
+            </w:pPr>
+            <w:r>
+              <w:rPr>
+                <w:b/>
+                <w:bCs/>
+                <w:sz w:val="17"/>
+                <w:szCs w:val="17"/>
+              </w:rPr>
+              <w:t xml:space="preserve">Patrón</w:t>
+            </w:r>
+          </w:p>
+        </w:tc>
+        <w:tc>
+          <w:tcPr>
+            <w:tcW w:w="2600" w:type="dxa"/>
+            <w:shd w:val="clear" w:color="auto" w:fill="D9E2F3"/>
+          </w:tcPr>
+          <w:p>
+            <w:pPr>
+              <w:spacing w:before="0" w:after="40" w:line="240" w:lineRule="auto"/>
+            </w:pPr>
+            <w:r>
+              <w:rPr>
+                <w:b/>
+                <w:bCs/>
+                <w:sz w:val="17"/>
+                <w:szCs w:val="17"/>
+              </w:rPr>
+              <w:t xml:space="preserve">Dónde</w:t>
+            </w:r>
+          </w:p>
+        </w:tc>
+        <w:tc>
+          <w:tcPr>
+            <w:tcW w:w="4658" w:type="dxa"/>
+            <w:shd w:val="clear" w:color="auto" w:fill="D9E2F3"/>
+          </w:tcPr>
+          <w:p>
+            <w:pPr>
+              <w:spacing w:before="0" w:after="40" w:line="240" w:lineRule="auto"/>
+            </w:pPr>
+            <w:r>
+              <w:rPr>
+                <w:b/>
+                <w:bCs/>
+                <w:sz w:val="17"/>
+                <w:szCs w:val="17"/>
+              </w:rPr>
+              <w:t xml:space="preserve">Cómo se aplica</w:t>
+            </w:r>
+          </w:p>
+        </w:tc>
+      </w:tr>
+      <w:tr>
+        <w:trPr>
+          <w:cantSplit/>
+        </w:trPr>
+        <w:tc>
+          <w:tcPr>
+            <w:tcW w:w="1700" w:type="dxa"/>
+          </w:tcPr>
+          <w:p>
+            <w:pPr>
+              <w:spacing w:before="0" w:after="40" w:line="240" w:lineRule="auto"/>
+            </w:pPr>
+            <w:r>
+              <w:rPr>
+                <w:b/>
+                <w:bCs/>
+                <w:sz w:val="17"/>
+                <w:szCs w:val="17"/>
+              </w:rPr>
+              <w:t xml:space="preserve">Controlador</w:t>
+            </w:r>
+          </w:p>
+        </w:tc>
+        <w:tc>
+          <w:tcPr>
+            <w:tcW w:w="2600" w:type="dxa"/>
+          </w:tcPr>
+          <w:p>
+            <w:pPr>
+              <w:spacing w:before="0" w:after="40" w:line="240" w:lineRule="auto"/>
+            </w:pPr>
+            <w:r>
+              <w:rPr>
+                <w:sz w:val="17"/>
+                <w:szCs w:val="17"/>
+              </w:rPr>
+              <w:t xml:space="preserve">PacienteController, OdontologoController, TurnoController</w:t>
+            </w:r>
+          </w:p>
+        </w:tc>
+        <w:tc>
+          <w:tcPr>
+            <w:tcW w:w="4658" w:type="dxa"/>
+          </w:tcPr>
+          <w:p>
+            <w:pPr>
+              <w:spacing w:before="0" w:after="40" w:line="240" w:lineRule="auto"/>
+            </w:pPr>
+            <w:r>
+              <w:rPr>
+                <w:sz w:val="17"/>
+                <w:szCs w:val="17"/>
+              </w:rPr>
+              <w:t xml:space="preserve">Reciben las operaciones que pide la pantalla y las coordinan con los servicios.</w:t>
+            </w:r>
+          </w:p>
+        </w:tc>
+      </w:tr>
+      <w:tr>
+        <w:trPr>
+          <w:cantSplit/>
+        </w:trPr>
+        <w:tc>
+          <w:tcPr>
+            <w:tcW w:w="1700" w:type="dxa"/>
+          </w:tcPr>
+          <w:p>
+            <w:pPr>
+              <w:spacing w:before="0" w:after="40" w:line="240" w:lineRule="auto"/>
+            </w:pPr>
+            <w:r>
+              <w:rPr>
+                <w:b/>
+                <w:bCs/>
+                <w:sz w:val="17"/>
+                <w:szCs w:val="17"/>
+              </w:rPr>
+              <w:t xml:space="preserve">Creador</w:t>
+            </w:r>
+          </w:p>
+        </w:tc>
+        <w:tc>
+          <w:tcPr>
+            <w:tcW w:w="2600" w:type="dxa"/>
+          </w:tcPr>
+          <w:p>
+            <w:pPr>
+              <w:spacing w:before="0" w:after="40" w:line="240" w:lineRule="auto"/>
+            </w:pPr>
+            <w:r>
+              <w:rPr>
+                <w:sz w:val="17"/>
+                <w:szCs w:val="17"/>
+              </w:rPr>
+              <w:t xml:space="preserve">Controladores</w:t>
+            </w:r>
+          </w:p>
+        </w:tc>
+        <w:tc>
+          <w:tcPr>
+            <w:tcW w:w="4658" w:type="dxa"/>
+          </w:tcPr>
+          <w:p>
+            <w:pPr>
+              <w:spacing w:before="0" w:after="40" w:line="240" w:lineRule="auto"/>
+            </w:pPr>
+            <w:r>
+              <w:rPr>
+                <w:sz w:val="17"/>
+                <w:szCs w:val="17"/>
+              </w:rPr>
+              <w:t xml:space="preserve">Crean Paciente y Domicilio, Odontologo y Turno, porque reciben los datos necesarios para inicializarlos.</w:t>
+            </w:r>
+          </w:p>
+        </w:tc>
+      </w:tr>
+      <w:tr>
+        <w:trPr>
+          <w:cantSplit/>
+        </w:trPr>
+        <w:tc>
+          <w:tcPr>
+            <w:tcW w:w="1700" w:type="dxa"/>
+          </w:tcPr>
+          <w:p>
+            <w:pPr>
+              <w:spacing w:before="0" w:after="40" w:line="240" w:lineRule="auto"/>
+            </w:pPr>
+            <w:r>
+              <w:rPr>
+                <w:b/>
+                <w:bCs/>
+                <w:sz w:val="17"/>
+                <w:szCs w:val="17"/>
+              </w:rPr>
+              <w:t xml:space="preserve">Experto en información</w:t>
+            </w:r>
+          </w:p>
+        </w:tc>
+        <w:tc>
+          <w:tcPr>
+            <w:tcW w:w="2600" w:type="dxa"/>
+          </w:tcPr>
+          <w:p>
+            <w:pPr>
+              <w:spacing w:before="0" w:after="40" w:line="240" w:lineRule="auto"/>
+            </w:pPr>
+            <w:r>
+              <w:rPr>
+                <w:sz w:val="17"/>
+                <w:szCs w:val="17"/>
+              </w:rPr>
+              <w:t xml:space="preserve">Domicilio.getResumen(), Turno.getDuracion()</w:t>
+            </w:r>
+          </w:p>
+        </w:tc>
+        <w:tc>
+          <w:tcPr>
+            <w:tcW w:w="4658" w:type="dxa"/>
+          </w:tcPr>
+          <w:p>
+            <w:pPr>
+              <w:spacing w:before="0" w:after="40" w:line="240" w:lineRule="auto"/>
+            </w:pPr>
+            <w:r>
+              <w:rPr>
+                <w:sz w:val="17"/>
+                <w:szCs w:val="17"/>
+              </w:rPr>
+              <w:t xml:space="preserve">La clase que tiene los datos calcula la información: el domicilio arma su resumen para la tabla y el turno obtiene su duración del odontólogo.</w:t>
+            </w:r>
+          </w:p>
+        </w:tc>
+      </w:tr>
+      <w:tr>
+        <w:trPr>
+          <w:cantSplit/>
+        </w:trPr>
+        <w:tc>
+          <w:tcPr>
+            <w:tcW w:w="1700" w:type="dxa"/>
+          </w:tcPr>
+          <w:p>
+            <w:pPr>
+              <w:spacing w:before="0" w:after="40" w:line="240" w:lineRule="auto"/>
+            </w:pPr>
+            <w:r>
+              <w:rPr>
+                <w:b/>
+                <w:bCs/>
+                <w:sz w:val="17"/>
+                <w:szCs w:val="17"/>
+              </w:rPr>
+              <w:t xml:space="preserve">Bajo acoplamiento</w:t>
+            </w:r>
+          </w:p>
+        </w:tc>
+        <w:tc>
+          <w:tcPr>
+            <w:tcW w:w="2600" w:type="dxa"/>
+          </w:tcPr>
+          <w:p>
+            <w:pPr>
+              <w:spacing w:before="0" w:after="40" w:line="240" w:lineRule="auto"/>
+            </w:pPr>
+            <w:r>
+              <w:rPr>
+                <w:sz w:val="17"/>
+                <w:szCs w:val="17"/>
+              </w:rPr>
+              <w:t xml:space="preserve">Vistas, servicios</w:t>
+            </w:r>
+          </w:p>
+        </w:tc>
+        <w:tc>
+          <w:tcPr>
+            <w:tcW w:w="4658" w:type="dxa"/>
+          </w:tcPr>
+          <w:p>
+            <w:pPr>
+              <w:spacing w:before="0" w:after="40" w:line="240" w:lineRule="auto"/>
+            </w:pPr>
+            <w:r>
+              <w:rPr>
+                <w:sz w:val="17"/>
+                <w:szCs w:val="17"/>
+              </w:rPr>
+              <w:t xml:space="preserve">Cada pantalla depende de un solo controlador; los servicios dependen de la interfaz IRepositorio y no de una implementación concreta.</w:t>
+            </w:r>
+          </w:p>
+        </w:tc>
+      </w:tr>
+      <w:tr>
+        <w:trPr>
+          <w:cantSplit/>
+        </w:trPr>
+        <w:tc>
+          <w:tcPr>
+            <w:tcW w:w="1700" w:type="dxa"/>
+          </w:tcPr>
+          <w:p>
+            <w:pPr>
+              <w:spacing w:before="0" w:after="40" w:line="240" w:lineRule="auto"/>
+            </w:pPr>
+            <w:r>
+              <w:rPr>
+                <w:b/>
+                <w:bCs/>
+                <w:sz w:val="17"/>
+                <w:szCs w:val="17"/>
+              </w:rPr>
+              <w:t xml:space="preserve">Alta cohesión</w:t>
+            </w:r>
+          </w:p>
+        </w:tc>
+        <w:tc>
+          <w:tcPr>
+            <w:tcW w:w="2600" w:type="dxa"/>
+          </w:tcPr>
+          <w:p>
+            <w:pPr>
+              <w:spacing w:before="0" w:after="40" w:line="240" w:lineRule="auto"/>
+            </w:pPr>
+            <w:r>
+              <w:rPr>
+                <w:sz w:val="17"/>
+                <w:szCs w:val="17"/>
+              </w:rPr>
+              <w:t xml:space="preserve">Main, MainFrame, repositorios</w:t>
+            </w:r>
+          </w:p>
+        </w:tc>
+        <w:tc>
+          <w:tcPr>
+            <w:tcW w:w="4658" w:type="dxa"/>
+          </w:tcPr>
+          <w:p>
+            <w:pPr>
+              <w:spacing w:before="0" w:after="40" w:line="240" w:lineRule="auto"/>
+            </w:pPr>
+            <w:r>
+              <w:rPr>
+                <w:sz w:val="17"/>
+                <w:szCs w:val="17"/>
+              </w:rPr>
+              <w:t xml:space="preserve">Cada clase tiene una responsabilidad clara: Main arma el sistema, MainFrame muestra la ventana y RepoArchivo resuelve la persistencia.</w:t>
+            </w:r>
+          </w:p>
+        </w:tc>
+      </w:tr>
+      <w:tr>
+        <w:trPr>
+          <w:cantSplit/>
+        </w:trPr>
+        <w:tc>
+          <w:tcPr>
+            <w:tcW w:w="1700" w:type="dxa"/>
+          </w:tcPr>
+          <w:p>
+            <w:pPr>
+              <w:spacing w:before="0" w:after="40" w:line="240" w:lineRule="auto"/>
+            </w:pPr>
+            <w:r>
+              <w:rPr>
+                <w:b/>
+                <w:bCs/>
+                <w:sz w:val="17"/>
+                <w:szCs w:val="17"/>
+              </w:rPr>
+              <w:t xml:space="preserve">Polimorfismo</w:t>
+            </w:r>
+          </w:p>
+        </w:tc>
+        <w:tc>
+          <w:tcPr>
+            <w:tcW w:w="2600" w:type="dxa"/>
+          </w:tcPr>
+          <w:p>
+            <w:pPr>
+              <w:spacing w:before="0" w:after="40" w:line="240" w:lineRule="auto"/>
+            </w:pPr>
+            <w:r>
+              <w:rPr>
+                <w:sz w:val="17"/>
+                <w:szCs w:val="17"/>
+              </w:rPr>
+              <w:t xml:space="preserve">Especialidades de Odontologo</w:t>
+            </w:r>
+          </w:p>
+        </w:tc>
+        <w:tc>
+          <w:tcPr>
+            <w:tcW w:w="4658" w:type="dxa"/>
+          </w:tcPr>
+          <w:p>
+            <w:pPr>
+              <w:spacing w:before="0" w:after="40" w:line="240" w:lineRule="auto"/>
+            </w:pPr>
+            <w:r>
+              <w:rPr>
+                <w:sz w:val="17"/>
+                <w:szCs w:val="17"/>
+              </w:rPr>
+              <w:t xml:space="preserve">Cada especialidad redefine calcularDuracionTurno() y getEspecialidad(), sin preguntar por el tipo (ya existía y se mantiene).</w:t>
+            </w:r>
+          </w:p>
+        </w:tc>
+      </w:tr>
+      <w:tr>
+        <w:trPr>
+          <w:cantSplit/>
+        </w:trPr>
+        <w:tc>
+          <w:tcPr>
+            <w:tcW w:w="1700" w:type="dxa"/>
+          </w:tcPr>
+          <w:p>
+            <w:pPr>
+              <w:spacing w:before="0" w:after="40" w:line="240" w:lineRule="auto"/>
+            </w:pPr>
+            <w:r>
+              <w:rPr>
+                <w:b/>
+                <w:bCs/>
+                <w:sz w:val="17"/>
+                <w:szCs w:val="17"/>
+              </w:rPr>
+              <w:t xml:space="preserve">Fabricación pura</w:t>
+            </w:r>
+          </w:p>
+        </w:tc>
+        <w:tc>
+          <w:tcPr>
+            <w:tcW w:w="2600" w:type="dxa"/>
+          </w:tcPr>
+          <w:p>
+            <w:pPr>
+              <w:spacing w:before="0" w:after="40" w:line="240" w:lineRule="auto"/>
+            </w:pPr>
+            <w:r>
+              <w:rPr>
+                <w:sz w:val="17"/>
+                <w:szCs w:val="17"/>
+              </w:rPr>
+              <w:t xml:space="preserve">RepoArchivo y repositorios</w:t>
+            </w:r>
+          </w:p>
+        </w:tc>
+        <w:tc>
+          <w:tcPr>
+            <w:tcW w:w="4658" w:type="dxa"/>
+          </w:tcPr>
+          <w:p>
+            <w:pPr>
+              <w:spacing w:before="0" w:after="40" w:line="240" w:lineRule="auto"/>
+            </w:pPr>
+            <w:r>
+              <w:rPr>
+                <w:sz w:val="17"/>
+                <w:szCs w:val="17"/>
+              </w:rPr>
+              <w:t xml:space="preserve">Clases que no representan un concepto de la clínica y existen para separar la persistencia del modelo.</w:t>
+            </w:r>
+          </w:p>
+        </w:tc>
+      </w:tr>
+    </w:tbl>
+    <w:p>
+      <w:pPr>
+        <w:pStyle w:val="Heading2"/>
+        <w:rPr/>
+      </w:pPr>
+      <w:r>
+        <w:rPr>
+          <w:rtl w:val="0"/>
+        </w:rPr>
+        <w:t xml:space="preserve">4.3. Domicilio del paciente</w:t>
+      </w:r>
+    </w:p>
+    <w:p>
+      <w:pPr>
+        <w:rPr/>
+      </w:pPr>
+      <w:r>
+        <w:rPr>
+          <w:rtl w:val="0"/>
+        </w:rPr>
+        <w:t xml:space="preserve">Antes, al registrar un paciente se guardaba siempre un domicilio de ejemplo (“Calle 123, Ciudad, Provincia”). Ahora la ficha del paciente permite cargarlo y modificarlo:</w:t>
       </w:r>
     </w:p>
     <w:p>
@@ -3638,26 +4947,26 @@
           <w:vertAlign w:val="baseline"/>
           <w:rtl w:val="0"/>
         </w:rPr>
-        <w:t xml:space="preserve">Controladores: </w:t>
-      </w:r>
-      <w:r>
-        <w:rPr>
-          <w:rFonts w:ascii="Arial" w:cs="Arial" w:eastAsia="Arial" w:hAnsi="Arial"/>
-          <w:b w:val="0"/>
-          <w:bCs w:val="0"/>
-          <w:i w:val="0"/>
-          <w:iCs w:val="0"/>
-          <w:smallCaps w:val="0"/>
-          <w:strike w:val="0"/>
-          <w:color w:val="000000"/>
-          <w:sz w:val="21"/>
-          <w:szCs w:val="21"/>
-          <w:u w:val="none"/>
-          <w:shd w:fill="auto" w:val="clear"/>
-          <w:vertAlign w:val="baseline"/>
-          <w:rtl w:val="0"/>
-        </w:rPr>
-        <w:t xml:space="preserve">se agregaron PacienteController, OdontologoController y TurnoController. Las pantallas ya no llaman directamente a los servicios ni crean objetos del modelo: le pasan los datos al controlador, que crea el paciente, el odontólogo o el turno y los envía al servicio (patrones Controlador y Creador).</w:t>
+        <w:t xml:space="preserve">Campos nuevos: </w:t>
+      </w:r>
+      <w:r>
+        <w:rPr>
+          <w:rFonts w:ascii="Arial" w:cs="Arial" w:eastAsia="Arial" w:hAnsi="Arial"/>
+          <w:b w:val="0"/>
+          <w:bCs w:val="0"/>
+          <w:i w:val="0"/>
+          <w:iCs w:val="0"/>
+          <w:smallCaps w:val="0"/>
+          <w:strike w:val="0"/>
+          <w:color w:val="000000"/>
+          <w:sz w:val="21"/>
+          <w:szCs w:val="21"/>
+          <w:u w:val="none"/>
+          <w:shd w:fill="auto" w:val="clear"/>
+          <w:vertAlign w:val="baseline"/>
+          <w:rtl w:val="0"/>
+        </w:rPr>
+        <w:t xml:space="preserve">calle, número, localidad, provincia y código postal, debajo del e-mail.</w:t>
       </w:r>
     </w:p>
     <w:p>
@@ -3713,26 +5022,26 @@
           <w:vertAlign w:val="baseline"/>
           <w:rtl w:val="0"/>
         </w:rPr>
-        <w:t xml:space="preserve">Persistencia: </w:t>
-      </w:r>
-      <w:r>
-        <w:rPr>
-          <w:rFonts w:ascii="Arial" w:cs="Arial" w:eastAsia="Arial" w:hAnsi="Arial"/>
-          <w:b w:val="0"/>
-          <w:bCs w:val="0"/>
-          <w:i w:val="0"/>
-          <w:iCs w:val="0"/>
-          <w:smallCaps w:val="0"/>
-          <w:strike w:val="0"/>
-          <w:color w:val="000000"/>
-          <w:sz w:val="21"/>
-          <w:szCs w:val="21"/>
-          <w:u w:val="none"/>
-          <w:shd w:fill="auto" w:val="clear"/>
-          <w:vertAlign w:val="baseline"/>
-          <w:rtl w:val="0"/>
-        </w:rPr>
-        <w:t xml:space="preserve">la lectura y escritura de los archivos .dat, que estaba repetida en los tres repositorios, se unificó en una clase base RepoArchivo. Cada repositorio solo indica qué dato usa como clave (DNI, matrícula o ID).</w:t>
+        <w:t xml:space="preserve">Validaciones: </w:t>
+      </w:r>
+      <w:r>
+        <w:rPr>
+          <w:rFonts w:ascii="Arial" w:cs="Arial" w:eastAsia="Arial" w:hAnsi="Arial"/>
+          <w:b w:val="0"/>
+          <w:bCs w:val="0"/>
+          <w:i w:val="0"/>
+          <w:iCs w:val="0"/>
+          <w:smallCaps w:val="0"/>
+          <w:strike w:val="0"/>
+          <w:color w:val="000000"/>
+          <w:sz w:val="21"/>
+          <w:szCs w:val="21"/>
+          <w:u w:val="none"/>
+          <w:shd w:fill="auto" w:val="clear"/>
+          <w:vertAlign w:val="baseline"/>
+          <w:rtl w:val="0"/>
+        </w:rPr>
+        <w:t xml:space="preserve">todos los campos son obligatorios, el número admite solo dígitos y el código postal acepta 4 dígitos (1425) o el formato CPA (C1425ABC). Los campos inválidos se marcan en rojo.</w:t>
       </w:r>
     </w:p>
     <w:p>
@@ -3788,26 +5097,26 @@
           <w:vertAlign w:val="baseline"/>
           <w:rtl w:val="0"/>
         </w:rPr>
-        <w:t xml:space="preserve">Servicios: </w:t>
-      </w:r>
-      <w:r>
-        <w:rPr>
-          <w:rFonts w:ascii="Arial" w:cs="Arial" w:eastAsia="Arial" w:hAnsi="Arial"/>
-          <w:b w:val="0"/>
-          <w:bCs w:val="0"/>
-          <w:i w:val="0"/>
-          <w:iCs w:val="0"/>
-          <w:smallCaps w:val="0"/>
-          <w:strike w:val="0"/>
-          <w:color w:val="000000"/>
-          <w:sz w:val="21"/>
-          <w:szCs w:val="21"/>
-          <w:u w:val="none"/>
-          <w:shd w:fill="auto" w:val="clear"/>
-          <w:vertAlign w:val="baseline"/>
-          <w:rtl w:val="0"/>
-        </w:rPr>
-        <w:t xml:space="preserve">se unificaron validaciones que estaban duplicadas, como el control de horario ocupado de los turnos y la validación de los datos personales del paciente. Además, los métodos de alta, modificación y baja que siempre devolvían true ahora no devuelven nada (void).</w:t>
+        <w:t xml:space="preserve">Listado: </w:t>
+      </w:r>
+      <w:r>
+        <w:rPr>
+          <w:rFonts w:ascii="Arial" w:cs="Arial" w:eastAsia="Arial" w:hAnsi="Arial"/>
+          <w:b w:val="0"/>
+          <w:bCs w:val="0"/>
+          <w:i w:val="0"/>
+          <w:iCs w:val="0"/>
+          <w:smallCaps w:val="0"/>
+          <w:strike w:val="0"/>
+          <w:color w:val="000000"/>
+          <w:sz w:val="21"/>
+          <w:szCs w:val="21"/>
+          <w:u w:val="none"/>
+          <w:shd w:fill="auto" w:val="clear"/>
+          <w:vertAlign w:val="baseline"/>
+          <w:rtl w:val="0"/>
+        </w:rPr>
+        <w:t xml:space="preserve">la tabla de pacientes muestra una columna Domicilio con calle, número y localidad.</w:t>
       </w:r>
     </w:p>
     <w:p>
@@ -3863,37 +5172,26 @@
           <w:vertAlign w:val="baseline"/>
           <w:rtl w:val="0"/>
         </w:rPr>
-        <w:t xml:space="preserve">Inicio del programa: </w:t>
-      </w:r>
-      <w:r>
-        <w:rPr>
-          <w:rFonts w:ascii="Arial" w:cs="Arial" w:eastAsia="Arial" w:hAnsi="Arial"/>
-          <w:b w:val="0"/>
-          <w:bCs w:val="0"/>
-          <w:i w:val="0"/>
-          <w:iCs w:val="0"/>
-          <w:smallCaps w:val="0"/>
-          <w:strike w:val="0"/>
-          <w:color w:val="000000"/>
-          <w:sz w:val="21"/>
-          <w:szCs w:val="21"/>
-          <w:u w:val="none"/>
-          <w:shd w:fill="auto" w:val="clear"/>
-          <w:vertAlign w:val="baseline"/>
-          <w:rtl w:val="0"/>
-        </w:rPr>
-        <w:t xml:space="preserve">Main crea los repositorios, servicios y controladores; la ventana principal solo se encarga de mostrar las pantallas (responsabilidad única).</w:t>
-      </w:r>
-    </w:p>
-    <w:p>
-      <w:pPr>
-        <w:rPr/>
-      </w:pPr>
-      <w:r>
-        <w:rPr>
-          <w:rtl w:val="0"/>
-        </w:rPr>
-        <w:t xml:space="preserve">Estos cambios no modifican el funcionamiento: las pantallas, los mensajes de error, las validaciones y los archivos de datos son los mismos que en la versión anterior.</w:t>
+        <w:t xml:space="preserve">Datos anteriores: </w:t>
+      </w:r>
+      <w:r>
+        <w:rPr>
+          <w:rFonts w:ascii="Arial" w:cs="Arial" w:eastAsia="Arial" w:hAnsi="Arial"/>
+          <w:b w:val="0"/>
+          <w:bCs w:val="0"/>
+          <w:i w:val="0"/>
+          <w:iCs w:val="0"/>
+          <w:smallCaps w:val="0"/>
+          <w:strike w:val="0"/>
+          <w:color w:val="000000"/>
+          <w:sz w:val="21"/>
+          <w:szCs w:val="21"/>
+          <w:u w:val="none"/>
+          <w:shd w:fill="auto" w:val="clear"/>
+          <w:vertAlign w:val="baseline"/>
+          <w:rtl w:val="0"/>
+        </w:rPr>
+        <w:t xml:space="preserve">los archivos .dat existentes se siguen leyendo. Los pacientes cargados antes conservan el domicilio de ejemplo y deben completarlo al modificarlos.</w:t>
       </w:r>
     </w:p>
     <w:p>
@@ -3905,18 +5203,7 @@
         <w:rPr>
           <w:rtl w:val="0"/>
         </w:rPr>
-        <w:t xml:space="preserve">4.2. Domicilio del paciente</w:t>
-      </w:r>
-    </w:p>
-    <w:p>
-      <w:pPr>
-        <w:rPr/>
-      </w:pPr>
-      <w:r>
-        <w:rPr>
-          <w:rtl w:val="0"/>
-        </w:rPr>
-        <w:t xml:space="preserve">Antes, al registrar un paciente se guardaba siempre un domicilio de ejemplo (“Calle 123, Ciudad, Provincia”). Ahora la ficha del paciente permite cargarlo y modificarlo:</w:t>
+        <w:t xml:space="preserve">4.4. Otros cambios</w:t>
       </w:r>
     </w:p>
     <w:p>
@@ -3972,26 +5259,49 @@
           <w:vertAlign w:val="baseline"/>
           <w:rtl w:val="0"/>
         </w:rPr>
-        <w:t xml:space="preserve">Campos nuevos: </w:t>
-      </w:r>
-      <w:r>
-        <w:rPr>
-          <w:rFonts w:ascii="Arial" w:cs="Arial" w:eastAsia="Arial" w:hAnsi="Arial"/>
-          <w:b w:val="0"/>
-          <w:bCs w:val="0"/>
-          <w:i w:val="0"/>
-          <w:iCs w:val="0"/>
-          <w:smallCaps w:val="0"/>
-          <w:strike w:val="0"/>
-          <w:color w:val="000000"/>
-          <w:sz w:val="21"/>
-          <w:szCs w:val="21"/>
-          <w:u w:val="none"/>
-          <w:shd w:fill="auto" w:val="clear"/>
-          <w:vertAlign w:val="baseline"/>
-          <w:rtl w:val="0"/>
-        </w:rPr>
-        <w:t xml:space="preserve">calle, número, localidad, provincia y código postal, debajo del e-mail.</w:t>
+        <w:t xml:space="preserve">Eclipse: </w:t>
+      </w:r>
+      <w:r>
+        <w:rPr>
+          <w:rFonts w:ascii="Arial" w:cs="Arial" w:eastAsia="Arial" w:hAnsi="Arial"/>
+          <w:b w:val="0"/>
+          <w:bCs w:val="0"/>
+          <w:i w:val="0"/>
+          <w:iCs w:val="0"/>
+          <w:smallCaps w:val="0"/>
+          <w:strike w:val="0"/>
+          <w:color w:val="000000"/>
+          <w:sz w:val="21"/>
+          <w:szCs w:val="21"/>
+          <w:u w:val="none"/>
+          <w:shd w:fill="auto" w:val="clear"/>
+          <w:vertAlign w:val="baseline"/>
+          <w:rtl w:val="0"/>
+        </w:rPr>
+        <w:t xml:space="preserve">el proyecto se puede importar directamente en Eclipse (Java 21).</w:t>
+      </w:r>
+    </w:p>
+    <w:p>
+      <w:pPr>
+        <w:pStyle w:val="Heading2"/>
+        <w:rPr/>
+      </w:pPr>
+      <w:r>
+        <w:rPr>
+          <w:rtl w:val="0"/>
+        </w:rPr>
+        <w:t xml:space="preserve">4.5. Correcciones de errores</w:t>
+      </w:r>
+    </w:p>
+    <w:p>
+      <w:pPr>
+        <w:rPr/>
+      </w:pPr>
+      <w:r>
+        <w:rPr>
+          <w:rtl w:val="0"/>
+        </w:rPr>
+        <w:t xml:space="preserve">Se probó el sistema en detalle (reservas, modificaciones, bajas, búsquedas y reinicio del programa) y se corrigieron los errores encontrados:</w:t>
       </w:r>
     </w:p>
     <w:p>
@@ -4047,26 +5357,26 @@
           <w:vertAlign w:val="baseline"/>
           <w:rtl w:val="0"/>
         </w:rPr>
-        <w:t xml:space="preserve">Validaciones: </w:t>
-      </w:r>
-      <w:r>
-        <w:rPr>
-          <w:rFonts w:ascii="Arial" w:cs="Arial" w:eastAsia="Arial" w:hAnsi="Arial"/>
-          <w:b w:val="0"/>
-          <w:bCs w:val="0"/>
-          <w:i w:val="0"/>
-          <w:iCs w:val="0"/>
-          <w:smallCaps w:val="0"/>
-          <w:strike w:val="0"/>
-          <w:color w:val="000000"/>
-          <w:sz w:val="21"/>
-          <w:szCs w:val="21"/>
-          <w:u w:val="none"/>
-          <w:shd w:fill="auto" w:val="clear"/>
-          <w:vertAlign w:val="baseline"/>
-          <w:rtl w:val="0"/>
-        </w:rPr>
-        <w:t xml:space="preserve">todos los campos son obligatorios, el número admite solo dígitos y el código postal acepta 4 dígitos (1425) o el formato CPA (C1425ABC). Los campos inválidos se marcan en rojo.</w:t>
+        <w:t xml:space="preserve">Superposición de turnos: </w:t>
+      </w:r>
+      <w:r>
+        <w:rPr>
+          <w:rFonts w:ascii="Arial" w:cs="Arial" w:eastAsia="Arial" w:hAnsi="Arial"/>
+          <w:b w:val="0"/>
+          <w:bCs w:val="0"/>
+          <w:i w:val="0"/>
+          <w:iCs w:val="0"/>
+          <w:smallCaps w:val="0"/>
+          <w:strike w:val="0"/>
+          <w:color w:val="000000"/>
+          <w:sz w:val="21"/>
+          <w:szCs w:val="21"/>
+          <w:u w:val="none"/>
+          <w:shd w:fill="auto" w:val="clear"/>
+          <w:vertAlign w:val="baseline"/>
+          <w:rtl w:val="0"/>
+        </w:rPr>
+        <w:t xml:space="preserve">antes solo se rechazaba un turno con la misma hora exacta de inicio. Ahora se tiene en cuenta la duración de cada consulta, tanto para el odontólogo como para el paciente (un paciente ya no puede tener dos turnos al mismo tiempo con distintos odontólogos).</w:t>
       </w:r>
     </w:p>
     <w:p>
@@ -4122,26 +5432,26 @@
           <w:vertAlign w:val="baseline"/>
           <w:rtl w:val="0"/>
         </w:rPr>
-        <w:t xml:space="preserve">Listado: </w:t>
-      </w:r>
-      <w:r>
-        <w:rPr>
-          <w:rFonts w:ascii="Arial" w:cs="Arial" w:eastAsia="Arial" w:hAnsi="Arial"/>
-          <w:b w:val="0"/>
-          <w:bCs w:val="0"/>
-          <w:i w:val="0"/>
-          <w:iCs w:val="0"/>
-          <w:smallCaps w:val="0"/>
-          <w:strike w:val="0"/>
-          <w:color w:val="000000"/>
-          <w:sz w:val="21"/>
-          <w:szCs w:val="21"/>
-          <w:u w:val="none"/>
-          <w:shd w:fill="auto" w:val="clear"/>
-          <w:vertAlign w:val="baseline"/>
-          <w:rtl w:val="0"/>
-        </w:rPr>
-        <w:t xml:space="preserve">la tabla de pacientes muestra una columna Domicilio con calle, número y localidad.</w:t>
+        <w:t xml:space="preserve">Turnos cancelados: </w:t>
+      </w:r>
+      <w:r>
+        <w:rPr>
+          <w:rFonts w:ascii="Arial" w:cs="Arial" w:eastAsia="Arial" w:hAnsi="Arial"/>
+          <w:b w:val="0"/>
+          <w:bCs w:val="0"/>
+          <w:i w:val="0"/>
+          <w:iCs w:val="0"/>
+          <w:smallCaps w:val="0"/>
+          <w:strike w:val="0"/>
+          <w:color w:val="000000"/>
+          <w:sz w:val="21"/>
+          <w:szCs w:val="21"/>
+          <w:u w:val="none"/>
+          <w:shd w:fill="auto" w:val="clear"/>
+          <w:vertAlign w:val="baseline"/>
+          <w:rtl w:val="0"/>
+        </w:rPr>
+        <w:t xml:space="preserve">ya no ocupan el horario, que queda libre para otra reserva. Si un turno cancelado se reactiva, se controla que su horario siga libre.</w:t>
       </w:r>
     </w:p>
     <w:p>
@@ -4197,38 +5507,26 @@
           <w:vertAlign w:val="baseline"/>
           <w:rtl w:val="0"/>
         </w:rPr>
-        <w:t xml:space="preserve">Datos anteriores: </w:t>
-      </w:r>
-      <w:r>
-        <w:rPr>
-          <w:rFonts w:ascii="Arial" w:cs="Arial" w:eastAsia="Arial" w:hAnsi="Arial"/>
-          <w:b w:val="0"/>
-          <w:bCs w:val="0"/>
-          <w:i w:val="0"/>
-          <w:iCs w:val="0"/>
-          <w:smallCaps w:val="0"/>
-          <w:strike w:val="0"/>
-          <w:color w:val="000000"/>
-          <w:sz w:val="21"/>
-          <w:szCs w:val="21"/>
-          <w:u w:val="none"/>
-          <w:shd w:fill="auto" w:val="clear"/>
-          <w:vertAlign w:val="baseline"/>
-          <w:rtl w:val="0"/>
-        </w:rPr>
-        <w:t xml:space="preserve">los archivos .dat existentes se siguen leyendo. Los pacientes cargados antes conservan el domicilio de ejemplo y deben completarlo al modificarlos.</w:t>
-      </w:r>
-    </w:p>
-    <w:p>
-      <w:pPr>
-        <w:pStyle w:val="Heading2"/>
-        <w:rPr/>
-      </w:pPr>
-      <w:r>
-        <w:rPr>
-          <w:rtl w:val="0"/>
-        </w:rPr>
-        <w:t xml:space="preserve">4.3. Otros cambios</w:t>
+        <w:t xml:space="preserve">Horario de atención (RF04): </w:t>
+      </w:r>
+      <w:r>
+        <w:rPr>
+          <w:rFonts w:ascii="Arial" w:cs="Arial" w:eastAsia="Arial" w:hAnsi="Arial"/>
+          <w:b w:val="0"/>
+          <w:bCs w:val="0"/>
+          <w:i w:val="0"/>
+          <w:iCs w:val="0"/>
+          <w:smallCaps w:val="0"/>
+          <w:strike w:val="0"/>
+          <w:color w:val="000000"/>
+          <w:sz w:val="21"/>
+          <w:szCs w:val="21"/>
+          <w:u w:val="none"/>
+          <w:shd w:fill="auto" w:val="clear"/>
+          <w:vertAlign w:val="baseline"/>
+          <w:rtl w:val="0"/>
+        </w:rPr>
+        <w:t xml:space="preserve">no se permiten turnos en fechas pasadas ni fuera del horario de la clínica, de lunes a sábado de 08:00 a 20:00. Se tiene en cuenta la duración de la consulta para que el turno termine antes del cierre.</w:t>
       </w:r>
     </w:p>
     <w:p>
@@ -4284,49 +5582,26 @@
           <w:vertAlign w:val="baseline"/>
           <w:rtl w:val="0"/>
         </w:rPr>
-        <w:t xml:space="preserve">Eclipse: </w:t>
-      </w:r>
-      <w:r>
-        <w:rPr>
-          <w:rFonts w:ascii="Arial" w:cs="Arial" w:eastAsia="Arial" w:hAnsi="Arial"/>
-          <w:b w:val="0"/>
-          <w:bCs w:val="0"/>
-          <w:i w:val="0"/>
-          <w:iCs w:val="0"/>
-          <w:smallCaps w:val="0"/>
-          <w:strike w:val="0"/>
-          <w:color w:val="000000"/>
-          <w:sz w:val="21"/>
-          <w:szCs w:val="21"/>
-          <w:u w:val="none"/>
-          <w:shd w:fill="auto" w:val="clear"/>
-          <w:vertAlign w:val="baseline"/>
-          <w:rtl w:val="0"/>
-        </w:rPr>
-        <w:t xml:space="preserve">el proyecto se puede importar directamente en Eclipse (Java 21).</w:t>
-      </w:r>
-    </w:p>
-    <w:p>
-      <w:pPr>
-        <w:pStyle w:val="Heading2"/>
-        <w:rPr/>
-      </w:pPr>
-      <w:r>
-        <w:rPr>
-          <w:rtl w:val="0"/>
-        </w:rPr>
-        <w:t xml:space="preserve">4.4. Correcciones de errores</w:t>
-      </w:r>
-    </w:p>
-    <w:p>
-      <w:pPr>
-        <w:rPr/>
-      </w:pPr>
-      <w:r>
-        <w:rPr>
-          <w:rtl w:val="0"/>
-        </w:rPr>
-        <w:t xml:space="preserve">Se probó el sistema en detalle (reservas, modificaciones, bajas, búsquedas y reinicio del programa) y se corrigieron los errores encontrados:</w:t>
+        <w:t xml:space="preserve">Bajas: </w:t>
+      </w:r>
+      <w:r>
+        <w:rPr>
+          <w:rFonts w:ascii="Arial" w:cs="Arial" w:eastAsia="Arial" w:hAnsi="Arial"/>
+          <w:b w:val="0"/>
+          <w:bCs w:val="0"/>
+          <w:i w:val="0"/>
+          <w:iCs w:val="0"/>
+          <w:smallCaps w:val="0"/>
+          <w:strike w:val="0"/>
+          <w:color w:val="000000"/>
+          <w:sz w:val="21"/>
+          <w:szCs w:val="21"/>
+          <w:u w:val="none"/>
+          <w:shd w:fill="auto" w:val="clear"/>
+          <w:vertAlign w:val="baseline"/>
+          <w:rtl w:val="0"/>
+        </w:rPr>
+        <w:t xml:space="preserve">no se puede eliminar un paciente ni un odontólogo que tenga turnos registrados; primero hay que eliminar sus turnos. Antes quedaban turnos que mostraban datos de alguien ya eliminado.</w:t>
       </w:r>
     </w:p>
     <w:p>
@@ -4382,26 +5657,26 @@
           <w:vertAlign w:val="baseline"/>
           <w:rtl w:val="0"/>
         </w:rPr>
-        <w:t xml:space="preserve">Superposición de turnos: </w:t>
-      </w:r>
-      <w:r>
-        <w:rPr>
-          <w:rFonts w:ascii="Arial" w:cs="Arial" w:eastAsia="Arial" w:hAnsi="Arial"/>
-          <w:b w:val="0"/>
-          <w:bCs w:val="0"/>
-          <w:i w:val="0"/>
-          <w:iCs w:val="0"/>
-          <w:smallCaps w:val="0"/>
-          <w:strike w:val="0"/>
-          <w:color w:val="000000"/>
-          <w:sz w:val="21"/>
-          <w:szCs w:val="21"/>
-          <w:u w:val="none"/>
-          <w:shd w:fill="auto" w:val="clear"/>
-          <w:vertAlign w:val="baseline"/>
-          <w:rtl w:val="0"/>
-        </w:rPr>
-        <w:t xml:space="preserve">antes solo se rechazaba un turno con la misma hora exacta de inicio. Ahora se tiene en cuenta la duración de cada consulta, tanto para el odontólogo como para el paciente (un paciente ya no puede tener dos turnos al mismo tiempo con distintos odontólogos).</w:t>
+        <w:t xml:space="preserve">Datos tras reiniciar: </w:t>
+      </w:r>
+      <w:r>
+        <w:rPr>
+          <w:rFonts w:ascii="Arial" w:cs="Arial" w:eastAsia="Arial" w:hAnsi="Arial"/>
+          <w:b w:val="0"/>
+          <w:bCs w:val="0"/>
+          <w:i w:val="0"/>
+          <w:iCs w:val="0"/>
+          <w:smallCaps w:val="0"/>
+          <w:strike w:val="0"/>
+          <w:color w:val="000000"/>
+          <w:sz w:val="21"/>
+          <w:szCs w:val="21"/>
+          <w:u w:val="none"/>
+          <w:shd w:fill="auto" w:val="clear"/>
+          <w:vertAlign w:val="baseline"/>
+          <w:rtl w:val="0"/>
+        </w:rPr>
+        <w:t xml:space="preserve">los cambios en un paciente u odontólogo (por ejemplo, su nombre) ahora se ven también en sus turnos después de cerrar y volver a abrir el programa.</w:t>
       </w:r>
     </w:p>
     <w:p>
@@ -4457,26 +5732,26 @@
           <w:vertAlign w:val="baseline"/>
           <w:rtl w:val="0"/>
         </w:rPr>
-        <w:t xml:space="preserve">Turnos cancelados: </w:t>
-      </w:r>
-      <w:r>
-        <w:rPr>
-          <w:rFonts w:ascii="Arial" w:cs="Arial" w:eastAsia="Arial" w:hAnsi="Arial"/>
-          <w:b w:val="0"/>
-          <w:bCs w:val="0"/>
-          <w:i w:val="0"/>
-          <w:iCs w:val="0"/>
-          <w:smallCaps w:val="0"/>
-          <w:strike w:val="0"/>
-          <w:color w:val="000000"/>
-          <w:sz w:val="21"/>
-          <w:szCs w:val="21"/>
-          <w:u w:val="none"/>
-          <w:shd w:fill="auto" w:val="clear"/>
-          <w:vertAlign w:val="baseline"/>
-          <w:rtl w:val="0"/>
-        </w:rPr>
-        <w:t xml:space="preserve">ya no ocupan el horario, que queda libre para otra reserva. Si un turno cancelado se reactiva, se controla que su horario siga libre.</w:t>
+        <w:t xml:space="preserve">Pantalla de turnos: </w:t>
+      </w:r>
+      <w:r>
+        <w:rPr>
+          <w:rFonts w:ascii="Arial" w:cs="Arial" w:eastAsia="Arial" w:hAnsi="Arial"/>
+          <w:b w:val="0"/>
+          <w:bCs w:val="0"/>
+          <w:i w:val="0"/>
+          <w:iCs w:val="0"/>
+          <w:smallCaps w:val="0"/>
+          <w:strike w:val="0"/>
+          <w:color w:val="000000"/>
+          <w:sz w:val="21"/>
+          <w:szCs w:val="21"/>
+          <w:u w:val="none"/>
+          <w:shd w:fill="auto" w:val="clear"/>
+          <w:vertAlign w:val="baseline"/>
+          <w:rtl w:val="0"/>
+        </w:rPr>
+        <w:t xml:space="preserve">el formulario tiene barra de desplazamiento cuando la ventana es chica; al seleccionar un turno se muestran su paciente y su odontólogo (que no se pueden cambiar al modificar); la tabla se actualiza al entrar a la pestaña; la hora se acepta como 9:00 o 09:00.</w:t>
       </w:r>
     </w:p>
     <w:p>
@@ -4532,26 +5807,26 @@
           <w:vertAlign w:val="baseline"/>
           <w:rtl w:val="0"/>
         </w:rPr>
-        <w:t xml:space="preserve">Horario de atención (RF04): </w:t>
-      </w:r>
-      <w:r>
-        <w:rPr>
-          <w:rFonts w:ascii="Arial" w:cs="Arial" w:eastAsia="Arial" w:hAnsi="Arial"/>
-          <w:b w:val="0"/>
-          <w:bCs w:val="0"/>
-          <w:i w:val="0"/>
-          <w:iCs w:val="0"/>
-          <w:smallCaps w:val="0"/>
-          <w:strike w:val="0"/>
-          <w:color w:val="000000"/>
-          <w:sz w:val="21"/>
-          <w:szCs w:val="21"/>
-          <w:u w:val="none"/>
-          <w:shd w:fill="auto" w:val="clear"/>
-          <w:vertAlign w:val="baseline"/>
-          <w:rtl w:val="0"/>
-        </w:rPr>
-        <w:t xml:space="preserve">no se permiten turnos en fechas pasadas ni fuera del horario de la clínica, de lunes a sábado de 08:00 a 20:00. Se tiene en cuenta la duración de la consulta para que el turno termine antes del cierre.</w:t>
+        <w:t xml:space="preserve">Pantalla de odontólogos: </w:t>
+      </w:r>
+      <w:r>
+        <w:rPr>
+          <w:rFonts w:ascii="Arial" w:cs="Arial" w:eastAsia="Arial" w:hAnsi="Arial"/>
+          <w:b w:val="0"/>
+          <w:bCs w:val="0"/>
+          <w:i w:val="0"/>
+          <w:iCs w:val="0"/>
+          <w:smallCaps w:val="0"/>
+          <w:strike w:val="0"/>
+          <w:color w:val="000000"/>
+          <w:sz w:val="21"/>
+          <w:szCs w:val="21"/>
+          <w:u w:val="none"/>
+          <w:shd w:fill="auto" w:val="clear"/>
+          <w:vertAlign w:val="baseline"/>
+          <w:rtl w:val="0"/>
+        </w:rPr>
+        <w:t xml:space="preserve">la especialidad queda bloqueada al modificar, ya que antes se mostraba como modificada sin cambiar.</w:t>
       </w:r>
     </w:p>
     <w:p>
@@ -4607,26 +5882,38 @@
           <w:vertAlign w:val="baseline"/>
           <w:rtl w:val="0"/>
         </w:rPr>
-        <w:t xml:space="preserve">Bajas: </w:t>
-      </w:r>
-      <w:r>
-        <w:rPr>
-          <w:rFonts w:ascii="Arial" w:cs="Arial" w:eastAsia="Arial" w:hAnsi="Arial"/>
-          <w:b w:val="0"/>
-          <w:bCs w:val="0"/>
-          <w:i w:val="0"/>
-          <w:iCs w:val="0"/>
-          <w:smallCaps w:val="0"/>
-          <w:strike w:val="0"/>
-          <w:color w:val="000000"/>
-          <w:sz w:val="21"/>
-          <w:szCs w:val="21"/>
-          <w:u w:val="none"/>
-          <w:shd w:fill="auto" w:val="clear"/>
-          <w:vertAlign w:val="baseline"/>
-          <w:rtl w:val="0"/>
-        </w:rPr>
-        <w:t xml:space="preserve">no se puede eliminar un paciente ni un odontólogo que tenga turnos registrados; primero hay que eliminar sus turnos. Antes quedaban turnos que mostraban datos de alguien ya eliminado.</w:t>
+        <w:t xml:space="preserve">Validaciones y búsquedas: </w:t>
+      </w:r>
+      <w:r>
+        <w:rPr>
+          <w:rFonts w:ascii="Arial" w:cs="Arial" w:eastAsia="Arial" w:hAnsi="Arial"/>
+          <w:b w:val="0"/>
+          <w:bCs w:val="0"/>
+          <w:i w:val="0"/>
+          <w:iCs w:val="0"/>
+          <w:smallCaps w:val="0"/>
+          <w:strike w:val="0"/>
+          <w:color w:val="000000"/>
+          <w:sz w:val="21"/>
+          <w:szCs w:val="21"/>
+          <w:u w:val="none"/>
+          <w:shd w:fill="auto" w:val="clear"/>
+          <w:vertAlign w:val="baseline"/>
+          <w:rtl w:val="0"/>
+        </w:rPr>
+        <w:t xml:space="preserve">nombres y apellidos solo con letras, e-mail con formato válido, número de calle y matrícula mayores a 0. Buscar turnos de un DNI o matrícula inexistente ahora lo informa. Los números de ID ya no se saltean cuando se rechaza un alta.</w:t>
+      </w:r>
+    </w:p>
+    <w:p>
+      <w:pPr>
+        <w:pStyle w:val="Heading2"/>
+        <w:rPr/>
+      </w:pPr>
+      <w:r>
+        <w:rPr>
+          <w:rtl w:val="0"/>
+        </w:rPr>
+        <w:t xml:space="preserve">4.6. Pruebas realizadas</w:t>
       </w:r>
     </w:p>
     <w:p>
@@ -4682,26 +5969,26 @@
           <w:vertAlign w:val="baseline"/>
           <w:rtl w:val="0"/>
         </w:rPr>
-        <w:t xml:space="preserve">Datos tras reiniciar: </w:t>
-      </w:r>
-      <w:r>
-        <w:rPr>
-          <w:rFonts w:ascii="Arial" w:cs="Arial" w:eastAsia="Arial" w:hAnsi="Arial"/>
-          <w:b w:val="0"/>
-          <w:bCs w:val="0"/>
-          <w:i w:val="0"/>
-          <w:iCs w:val="0"/>
-          <w:smallCaps w:val="0"/>
-          <w:strike w:val="0"/>
-          <w:color w:val="000000"/>
-          <w:sz w:val="21"/>
-          <w:szCs w:val="21"/>
-          <w:u w:val="none"/>
-          <w:shd w:fill="auto" w:val="clear"/>
-          <w:vertAlign w:val="baseline"/>
-          <w:rtl w:val="0"/>
-        </w:rPr>
-        <w:t xml:space="preserve">los cambios en un paciente u odontólogo (por ejemplo, su nombre) ahora se ven también en sus turnos después de cerrar y volver a abrir el programa.</w:t>
+        <w:t xml:space="preserve">Datos guardados: </w:t>
+      </w:r>
+      <w:r>
+        <w:rPr>
+          <w:rFonts w:ascii="Arial" w:cs="Arial" w:eastAsia="Arial" w:hAnsi="Arial"/>
+          <w:b w:val="0"/>
+          <w:bCs w:val="0"/>
+          <w:i w:val="0"/>
+          <w:iCs w:val="0"/>
+          <w:smallCaps w:val="0"/>
+          <w:strike w:val="0"/>
+          <w:color w:val="000000"/>
+          <w:sz w:val="21"/>
+          <w:szCs w:val="21"/>
+          <w:u w:val="none"/>
+          <w:shd w:fill="auto" w:val="clear"/>
+          <w:vertAlign w:val="baseline"/>
+          <w:rtl w:val="0"/>
+        </w:rPr>
+        <w:t xml:space="preserve">carga de los archivos .dat existentes y conservación de los datos al reiniciar.</w:t>
       </w:r>
     </w:p>
     <w:p>
@@ -4757,26 +6044,26 @@
           <w:vertAlign w:val="baseline"/>
           <w:rtl w:val="0"/>
         </w:rPr>
-        <w:t xml:space="preserve">Pantalla de turnos: </w:t>
-      </w:r>
-      <w:r>
-        <w:rPr>
-          <w:rFonts w:ascii="Arial" w:cs="Arial" w:eastAsia="Arial" w:hAnsi="Arial"/>
-          <w:b w:val="0"/>
-          <w:bCs w:val="0"/>
-          <w:i w:val="0"/>
-          <w:iCs w:val="0"/>
-          <w:smallCaps w:val="0"/>
-          <w:strike w:val="0"/>
-          <w:color w:val="000000"/>
-          <w:sz w:val="21"/>
-          <w:szCs w:val="21"/>
-          <w:u w:val="none"/>
-          <w:shd w:fill="auto" w:val="clear"/>
-          <w:vertAlign w:val="baseline"/>
-          <w:rtl w:val="0"/>
-        </w:rPr>
-        <w:t xml:space="preserve">el formulario tiene barra de desplazamiento cuando la ventana es chica; al seleccionar un turno se muestran su paciente y su odontólogo (que no se pueden cambiar al modificar); la tabla se actualiza al entrar a la pestaña; la hora se acepta como 9:00 o 09:00.</w:t>
+        <w:t xml:space="preserve">Funcionamiento sin cambios: </w:t>
+      </w:r>
+      <w:r>
+        <w:rPr>
+          <w:rFonts w:ascii="Arial" w:cs="Arial" w:eastAsia="Arial" w:hAnsi="Arial"/>
+          <w:b w:val="0"/>
+          <w:bCs w:val="0"/>
+          <w:i w:val="0"/>
+          <w:iCs w:val="0"/>
+          <w:smallCaps w:val="0"/>
+          <w:strike w:val="0"/>
+          <w:color w:val="000000"/>
+          <w:sz w:val="21"/>
+          <w:szCs w:val="21"/>
+          <w:u w:val="none"/>
+          <w:shd w:fill="auto" w:val="clear"/>
+          <w:vertAlign w:val="baseline"/>
+          <w:rtl w:val="0"/>
+        </w:rPr>
+        <w:t xml:space="preserve">alta, modificación y baja de pacientes, odontólogos y turnos, con los mismos resultados y mensajes que la versión anterior; rechazo de turnos en un horario ocupado, de fechas mal escritas y de rangos de fechas invertidos.</w:t>
       </w:r>
     </w:p>
     <w:p>
@@ -4832,26 +6119,26 @@
           <w:vertAlign w:val="baseline"/>
           <w:rtl w:val="0"/>
         </w:rPr>
-        <w:t xml:space="preserve">Pantalla de odontólogos: </w:t>
-      </w:r>
-      <w:r>
-        <w:rPr>
-          <w:rFonts w:ascii="Arial" w:cs="Arial" w:eastAsia="Arial" w:hAnsi="Arial"/>
-          <w:b w:val="0"/>
-          <w:bCs w:val="0"/>
-          <w:i w:val="0"/>
-          <w:iCs w:val="0"/>
-          <w:smallCaps w:val="0"/>
-          <w:strike w:val="0"/>
-          <w:color w:val="000000"/>
-          <w:sz w:val="21"/>
-          <w:szCs w:val="21"/>
-          <w:u w:val="none"/>
-          <w:shd w:fill="auto" w:val="clear"/>
-          <w:vertAlign w:val="baseline"/>
-          <w:rtl w:val="0"/>
-        </w:rPr>
-        <w:t xml:space="preserve">la especialidad queda bloqueada al modificar, ya que antes se mostraba como modificada sin cambiar.</w:t>
+        <w:t xml:space="preserve">Domicilio: </w:t>
+      </w:r>
+      <w:r>
+        <w:rPr>
+          <w:rFonts w:ascii="Arial" w:cs="Arial" w:eastAsia="Arial" w:hAnsi="Arial"/>
+          <w:b w:val="0"/>
+          <w:bCs w:val="0"/>
+          <w:i w:val="0"/>
+          <w:iCs w:val="0"/>
+          <w:smallCaps w:val="0"/>
+          <w:strike w:val="0"/>
+          <w:color w:val="000000"/>
+          <w:sz w:val="21"/>
+          <w:szCs w:val="21"/>
+          <w:u w:val="none"/>
+          <w:shd w:fill="auto" w:val="clear"/>
+          <w:vertAlign w:val="baseline"/>
+          <w:rtl w:val="0"/>
+        </w:rPr>
+        <w:t xml:space="preserve">alta y modificación de un paciente con domicilio completo, y rechazo de calle vacía, número con letras y código postal inválido.</w:t>
       </w:r>
     </w:p>
     <w:p>
@@ -4907,26 +6194,26 @@
           <w:vertAlign w:val="baseline"/>
           <w:rtl w:val="0"/>
         </w:rPr>
-        <w:t xml:space="preserve">Validaciones y búsquedas: </w:t>
-      </w:r>
-      <w:r>
-        <w:rPr>
-          <w:rFonts w:ascii="Arial" w:cs="Arial" w:eastAsia="Arial" w:hAnsi="Arial"/>
-          <w:b w:val="0"/>
-          <w:bCs w:val="0"/>
-          <w:i w:val="0"/>
-          <w:iCs w:val="0"/>
-          <w:smallCaps w:val="0"/>
-          <w:strike w:val="0"/>
-          <w:color w:val="000000"/>
-          <w:sz w:val="21"/>
-          <w:szCs w:val="21"/>
-          <w:u w:val="none"/>
-          <w:shd w:fill="auto" w:val="clear"/>
-          <w:vertAlign w:val="baseline"/>
-          <w:rtl w:val="0"/>
-        </w:rPr>
-        <w:t xml:space="preserve">nombres y apellidos solo con letras, e-mail con formato válido, número de calle y matrícula mayores a 0. Buscar turnos de un DNI o matrícula inexistente ahora lo informa. Los números de ID ya no se saltean cuando se rechaza un alta.</w:t>
+        <w:t xml:space="preserve">Correcciones: </w:t>
+      </w:r>
+      <w:r>
+        <w:rPr>
+          <w:rFonts w:ascii="Arial" w:cs="Arial" w:eastAsia="Arial" w:hAnsi="Arial"/>
+          <w:b w:val="0"/>
+          <w:bCs w:val="0"/>
+          <w:i w:val="0"/>
+          <w:iCs w:val="0"/>
+          <w:smallCaps w:val="0"/>
+          <w:strike w:val="0"/>
+          <w:color w:val="000000"/>
+          <w:sz w:val="21"/>
+          <w:szCs w:val="21"/>
+          <w:u w:val="none"/>
+          <w:shd w:fill="auto" w:val="clear"/>
+          <w:vertAlign w:val="baseline"/>
+          <w:rtl w:val="0"/>
+        </w:rPr>
+        <w:t xml:space="preserve">reservas superpuestas por duración, turnos cancelados, fechas pasadas, domingos y horarios fuera de atención, bajas con turnos, datos después de reiniciar y pantallas de turnos y odontólogos, verificando que cada caso se comporte como se describe en 4.5.</w:t>
       </w:r>
     </w:p>
     <w:p>
@@ -4938,319 +6225,7 @@
         <w:rPr>
           <w:rtl w:val="0"/>
         </w:rPr>
-        <w:t xml:space="preserve">4.5. Pruebas realizadas</w:t>
-      </w:r>
-    </w:p>
-    <w:p>
-      <w:pPr>
-        <w:keepNext w:val="0"/>
-        <w:keepLines w:val="0"/>
-        <w:pageBreakBefore w:val="0"/>
-        <w:widowControl w:val="1"/>
-        <w:numPr>
-          <w:ilvl w:val="0"/>
-          <w:numId w:val="1"/>
-        </w:numPr>
-        <w:pBdr>
-          <w:top w:space="0" w:sz="0" w:val="nil"/>
-          <w:left w:space="0" w:sz="0" w:val="nil"/>
-          <w:bottom w:space="0" w:sz="0" w:val="nil"/>
-          <w:right w:space="0" w:sz="0" w:val="nil"/>
-          <w:between w:space="0" w:sz="0" w:val="nil"/>
-        </w:pBdr>
-        <w:shd w:fill="auto" w:val="clear"/>
-        <w:spacing w:after="0" w:before="0" w:line="269" w:lineRule="auto"/>
-        <w:ind w:left="360" w:right="0" w:hanging="360"/>
-        <w:jc w:val="left"/>
-        <w:rPr>
-          <w:b w:val="0"/>
-          <w:bCs w:val="0"/>
-          <w:i w:val="0"/>
-          <w:iCs w:val="0"/>
-          <w:smallCaps w:val="0"/>
-          <w:strike w:val="0"/>
-          <w:color w:val="000000"/>
-          <w:sz w:val="21"/>
-          <w:szCs w:val="21"/>
-          <w:u w:val="none"/>
-          <w:shd w:fill="auto" w:val="clear"/>
-          <w:vertAlign w:val="baseline"/>
-        </w:rPr>
-      </w:pPr>
-      <w:r>
-        <w:rPr>
-          <w:rFonts w:ascii="Arial" w:cs="Arial" w:eastAsia="Arial" w:hAnsi="Arial"/>
-          <w:b w:val="1"/>
-          <w:bCs w:val="1"/>
-          <w:i w:val="0"/>
-          <w:iCs w:val="0"/>
-          <w:smallCaps w:val="0"/>
-          <w:strike w:val="0"/>
-          <w:color w:val="000000"/>
-          <w:sz w:val="21"/>
-          <w:szCs w:val="21"/>
-          <w:u w:val="none"/>
-          <w:shd w:fill="auto" w:val="clear"/>
-          <w:vertAlign w:val="baseline"/>
-          <w:rtl w:val="0"/>
-        </w:rPr>
-        <w:t xml:space="preserve">Datos guardados: </w:t>
-      </w:r>
-      <w:r>
-        <w:rPr>
-          <w:rFonts w:ascii="Arial" w:cs="Arial" w:eastAsia="Arial" w:hAnsi="Arial"/>
-          <w:b w:val="0"/>
-          <w:bCs w:val="0"/>
-          <w:i w:val="0"/>
-          <w:iCs w:val="0"/>
-          <w:smallCaps w:val="0"/>
-          <w:strike w:val="0"/>
-          <w:color w:val="000000"/>
-          <w:sz w:val="21"/>
-          <w:szCs w:val="21"/>
-          <w:u w:val="none"/>
-          <w:shd w:fill="auto" w:val="clear"/>
-          <w:vertAlign w:val="baseline"/>
-          <w:rtl w:val="0"/>
-        </w:rPr>
-        <w:t xml:space="preserve">carga de los archivos .dat existentes y conservación de los datos al reiniciar.</w:t>
-      </w:r>
-    </w:p>
-    <w:p>
-      <w:pPr>
-        <w:keepNext w:val="0"/>
-        <w:keepLines w:val="0"/>
-        <w:pageBreakBefore w:val="0"/>
-        <w:widowControl w:val="1"/>
-        <w:numPr>
-          <w:ilvl w:val="0"/>
-          <w:numId w:val="1"/>
-        </w:numPr>
-        <w:pBdr>
-          <w:top w:space="0" w:sz="0" w:val="nil"/>
-          <w:left w:space="0" w:sz="0" w:val="nil"/>
-          <w:bottom w:space="0" w:sz="0" w:val="nil"/>
-          <w:right w:space="0" w:sz="0" w:val="nil"/>
-          <w:between w:space="0" w:sz="0" w:val="nil"/>
-        </w:pBdr>
-        <w:shd w:fill="auto" w:val="clear"/>
-        <w:spacing w:after="0" w:before="0" w:line="269" w:lineRule="auto"/>
-        <w:ind w:left="360" w:right="0" w:hanging="360"/>
-        <w:jc w:val="left"/>
-        <w:rPr>
-          <w:b w:val="0"/>
-          <w:bCs w:val="0"/>
-          <w:i w:val="0"/>
-          <w:iCs w:val="0"/>
-          <w:smallCaps w:val="0"/>
-          <w:strike w:val="0"/>
-          <w:color w:val="000000"/>
-          <w:sz w:val="21"/>
-          <w:szCs w:val="21"/>
-          <w:u w:val="none"/>
-          <w:shd w:fill="auto" w:val="clear"/>
-          <w:vertAlign w:val="baseline"/>
-        </w:rPr>
-      </w:pPr>
-      <w:r>
-        <w:rPr>
-          <w:rFonts w:ascii="Arial" w:cs="Arial" w:eastAsia="Arial" w:hAnsi="Arial"/>
-          <w:b w:val="1"/>
-          <w:bCs w:val="1"/>
-          <w:i w:val="0"/>
-          <w:iCs w:val="0"/>
-          <w:smallCaps w:val="0"/>
-          <w:strike w:val="0"/>
-          <w:color w:val="000000"/>
-          <w:sz w:val="21"/>
-          <w:szCs w:val="21"/>
-          <w:u w:val="none"/>
-          <w:shd w:fill="auto" w:val="clear"/>
-          <w:vertAlign w:val="baseline"/>
-          <w:rtl w:val="0"/>
-        </w:rPr>
-        <w:t xml:space="preserve">Funcionamiento sin cambios: </w:t>
-      </w:r>
-      <w:r>
-        <w:rPr>
-          <w:rFonts w:ascii="Arial" w:cs="Arial" w:eastAsia="Arial" w:hAnsi="Arial"/>
-          <w:b w:val="0"/>
-          <w:bCs w:val="0"/>
-          <w:i w:val="0"/>
-          <w:iCs w:val="0"/>
-          <w:smallCaps w:val="0"/>
-          <w:strike w:val="0"/>
-          <w:color w:val="000000"/>
-          <w:sz w:val="21"/>
-          <w:szCs w:val="21"/>
-          <w:u w:val="none"/>
-          <w:shd w:fill="auto" w:val="clear"/>
-          <w:vertAlign w:val="baseline"/>
-          <w:rtl w:val="0"/>
-        </w:rPr>
-        <w:t xml:space="preserve">alta, modificación y baja de pacientes, odontólogos y turnos, con los mismos resultados y mensajes que la versión anterior; rechazo de turnos en un horario ocupado, de fechas mal escritas y de rangos de fechas invertidos.</w:t>
-      </w:r>
-    </w:p>
-    <w:p>
-      <w:pPr>
-        <w:keepNext w:val="0"/>
-        <w:keepLines w:val="0"/>
-        <w:pageBreakBefore w:val="0"/>
-        <w:widowControl w:val="1"/>
-        <w:numPr>
-          <w:ilvl w:val="0"/>
-          <w:numId w:val="1"/>
-        </w:numPr>
-        <w:pBdr>
-          <w:top w:space="0" w:sz="0" w:val="nil"/>
-          <w:left w:space="0" w:sz="0" w:val="nil"/>
-          <w:bottom w:space="0" w:sz="0" w:val="nil"/>
-          <w:right w:space="0" w:sz="0" w:val="nil"/>
-          <w:between w:space="0" w:sz="0" w:val="nil"/>
-        </w:pBdr>
-        <w:shd w:fill="auto" w:val="clear"/>
-        <w:spacing w:after="0" w:before="0" w:line="269" w:lineRule="auto"/>
-        <w:ind w:left="360" w:right="0" w:hanging="360"/>
-        <w:jc w:val="left"/>
-        <w:rPr>
-          <w:b w:val="0"/>
-          <w:bCs w:val="0"/>
-          <w:i w:val="0"/>
-          <w:iCs w:val="0"/>
-          <w:smallCaps w:val="0"/>
-          <w:strike w:val="0"/>
-          <w:color w:val="000000"/>
-          <w:sz w:val="21"/>
-          <w:szCs w:val="21"/>
-          <w:u w:val="none"/>
-          <w:shd w:fill="auto" w:val="clear"/>
-          <w:vertAlign w:val="baseline"/>
-        </w:rPr>
-      </w:pPr>
-      <w:r>
-        <w:rPr>
-          <w:rFonts w:ascii="Arial" w:cs="Arial" w:eastAsia="Arial" w:hAnsi="Arial"/>
-          <w:b w:val="1"/>
-          <w:bCs w:val="1"/>
-          <w:i w:val="0"/>
-          <w:iCs w:val="0"/>
-          <w:smallCaps w:val="0"/>
-          <w:strike w:val="0"/>
-          <w:color w:val="000000"/>
-          <w:sz w:val="21"/>
-          <w:szCs w:val="21"/>
-          <w:u w:val="none"/>
-          <w:shd w:fill="auto" w:val="clear"/>
-          <w:vertAlign w:val="baseline"/>
-          <w:rtl w:val="0"/>
-        </w:rPr>
-        <w:t xml:space="preserve">Domicilio: </w:t>
-      </w:r>
-      <w:r>
-        <w:rPr>
-          <w:rFonts w:ascii="Arial" w:cs="Arial" w:eastAsia="Arial" w:hAnsi="Arial"/>
-          <w:b w:val="0"/>
-          <w:bCs w:val="0"/>
-          <w:i w:val="0"/>
-          <w:iCs w:val="0"/>
-          <w:smallCaps w:val="0"/>
-          <w:strike w:val="0"/>
-          <w:color w:val="000000"/>
-          <w:sz w:val="21"/>
-          <w:szCs w:val="21"/>
-          <w:u w:val="none"/>
-          <w:shd w:fill="auto" w:val="clear"/>
-          <w:vertAlign w:val="baseline"/>
-          <w:rtl w:val="0"/>
-        </w:rPr>
-        <w:t xml:space="preserve">alta y modificación de un paciente con domicilio completo, y rechazo de calle vacía, número con letras y código postal inválido.</w:t>
-      </w:r>
-    </w:p>
-    <w:p>
-      <w:pPr>
-        <w:keepNext w:val="0"/>
-        <w:keepLines w:val="0"/>
-        <w:pageBreakBefore w:val="0"/>
-        <w:widowControl w:val="1"/>
-        <w:numPr>
-          <w:ilvl w:val="0"/>
-          <w:numId w:val="1"/>
-        </w:numPr>
-        <w:pBdr>
-          <w:top w:space="0" w:sz="0" w:val="nil"/>
-          <w:left w:space="0" w:sz="0" w:val="nil"/>
-          <w:bottom w:space="0" w:sz="0" w:val="nil"/>
-          <w:right w:space="0" w:sz="0" w:val="nil"/>
-          <w:between w:space="0" w:sz="0" w:val="nil"/>
-        </w:pBdr>
-        <w:shd w:fill="auto" w:val="clear"/>
-        <w:spacing w:after="0" w:before="0" w:line="269" w:lineRule="auto"/>
-        <w:ind w:left="360" w:right="0" w:hanging="360"/>
-        <w:jc w:val="left"/>
-        <w:rPr>
-          <w:b w:val="0"/>
-          <w:bCs w:val="0"/>
-          <w:i w:val="0"/>
-          <w:iCs w:val="0"/>
-          <w:smallCaps w:val="0"/>
-          <w:strike w:val="0"/>
-          <w:color w:val="000000"/>
-          <w:sz w:val="21"/>
-          <w:szCs w:val="21"/>
-          <w:u w:val="none"/>
-          <w:shd w:fill="auto" w:val="clear"/>
-          <w:vertAlign w:val="baseline"/>
-        </w:rPr>
-      </w:pPr>
-      <w:r>
-        <w:rPr>
-          <w:rFonts w:ascii="Arial" w:cs="Arial" w:eastAsia="Arial" w:hAnsi="Arial"/>
-          <w:b w:val="1"/>
-          <w:bCs w:val="1"/>
-          <w:i w:val="0"/>
-          <w:iCs w:val="0"/>
-          <w:smallCaps w:val="0"/>
-          <w:strike w:val="0"/>
-          <w:color w:val="000000"/>
-          <w:sz w:val="21"/>
-          <w:szCs w:val="21"/>
-          <w:u w:val="none"/>
-          <w:shd w:fill="auto" w:val="clear"/>
-          <w:vertAlign w:val="baseline"/>
-          <w:rtl w:val="0"/>
-        </w:rPr>
-        <w:t xml:space="preserve">Correcciones: </w:t>
-      </w:r>
-      <w:r>
-        <w:rPr>
-          <w:rFonts w:ascii="Arial" w:cs="Arial" w:eastAsia="Arial" w:hAnsi="Arial"/>
-          <w:b w:val="0"/>
-          <w:bCs w:val="0"/>
-          <w:i w:val="0"/>
-          <w:iCs w:val="0"/>
-          <w:smallCaps w:val="0"/>
-          <w:strike w:val="0"/>
-          <w:color w:val="000000"/>
-          <w:sz w:val="21"/>
-          <w:szCs w:val="21"/>
-          <w:u w:val="none"/>
-          <w:shd w:fill="auto" w:val="clear"/>
-          <w:vertAlign w:val="baseline"/>
-          <w:rtl w:val="0"/>
-        </w:rPr>
-        <w:t xml:space="preserve">reservas superpuestas por duración, turnos cancelados, fechas pasadas, domingos y horarios fuera de atención, bajas con turnos, datos después de reiniciar y pantallas de turnos y odontólogos, verificando que cada caso se comporte como se describe en 4.4.</w:t>
-      </w:r>
-    </w:p>
-    <w:p>
-      <w:pPr>
-        <w:pStyle w:val="Heading2"/>
-        <w:rPr/>
-      </w:pPr>
-      <w:r>
-        <w:rPr>
-          <w:rtl w:val="0"/>
-        </w:rPr>
-        <w:t xml:space="preserve">4.6. Estado de los requerimientos</w:t>
+        <w:t xml:space="preserve">4.7. Estado de los requerimientos</w:t>
       </w:r>
     </w:p>
     <w:p>

</xml_diff>